<commit_message>
Agregar sección de Auditoría y validación (5 pasos) al guion de sustentación
</commit_message>
<xml_diff>
--- a/Guion de sustentación - Rúbrica - Bank Marketing.docx
+++ b/Guion de sustentación - Rúbrica - Bank Marketing.docx
@@ -1165,15 +1165,7 @@
           </w:tcPr>
           <w:p>
             <w:r>
-              <w:t xml:space="preserve">Claridad del problema; objetivos; definición de variables predictoras y variable objetivo; identificación del tipo de tarea de Machine </w:t>
-            </w:r>
-            <w:proofErr w:type="spellStart"/>
-            <w:r>
-              <w:t>Learning</w:t>
-            </w:r>
-            <w:proofErr w:type="spellEnd"/>
-            <w:r>
-              <w:t>; formulación matemática del problema.</w:t>
+              <w:t>Claridad del problema; objetivos; definición de variables predictoras y variable objetivo; identificación del tipo de tarea de Machine Learning; formulación matemática del problema.</w:t>
             </w:r>
           </w:p>
         </w:tc>
@@ -1294,55 +1286,7 @@
         <w:t>predictoras</w:t>
       </w:r>
       <w:r>
-        <w:t xml:space="preserve"> son 17 variables conocidas antes de la llamada: el perfil del cliente (edad, ocupación, estado civil, educación y créditos), el historial de contactos (</w:t>
-      </w:r>
-      <w:proofErr w:type="spellStart"/>
-      <w:r>
-        <w:t>pdays</w:t>
-      </w:r>
-      <w:proofErr w:type="spellEnd"/>
-      <w:r>
-        <w:t xml:space="preserve">, </w:t>
-      </w:r>
-      <w:proofErr w:type="spellStart"/>
-      <w:r>
-        <w:t>previous</w:t>
-      </w:r>
-      <w:proofErr w:type="spellEnd"/>
-      <w:r>
-        <w:t xml:space="preserve">, </w:t>
-      </w:r>
-      <w:proofErr w:type="spellStart"/>
-      <w:r>
-        <w:t>poutcome</w:t>
-      </w:r>
-      <w:proofErr w:type="spellEnd"/>
-      <w:r>
-        <w:t xml:space="preserve"> y </w:t>
-      </w:r>
-      <w:proofErr w:type="spellStart"/>
-      <w:r>
-        <w:t>campaign</w:t>
-      </w:r>
-      <w:proofErr w:type="spellEnd"/>
-      <w:r>
-        <w:t xml:space="preserve">), el canal y la fecha del contacto, y el contexto económico (índices de precios y de confianza del consumidor y número de empleados). </w:t>
-      </w:r>
-      <w:proofErr w:type="spellStart"/>
-      <w:r>
-        <w:t>Duration</w:t>
-      </w:r>
-      <w:proofErr w:type="spellEnd"/>
-      <w:r>
-        <w:t xml:space="preserve"> queda fuera de las predictoras porque solo se conoce al terminar la llamada; en la regresión es el objetivo, como log1p(</w:t>
-      </w:r>
-      <w:proofErr w:type="spellStart"/>
-      <w:r>
-        <w:t>duration</w:t>
-      </w:r>
-      <w:proofErr w:type="spellEnd"/>
-      <w:r>
-        <w:t>).</w:t>
+        <w:t xml:space="preserve"> son 17 variables conocidas antes de la llamada: el perfil del cliente (edad, ocupación, estado civil, educación y créditos), el historial de contactos (pdays, previous, poutcome y campaign), el canal y la fecha del contacto, y el contexto económico (índices de precios y de confianza del consumidor y número de empleados). Duration queda fuera de las predictoras porque solo se conoce al terminar la llamada; en la regresión es el objetivo, como log1p(duration).</w:t>
       </w:r>
     </w:p>
     <w:p>
@@ -1371,15 +1315,7 @@
         <w:t>regresión</w:t>
       </w:r>
       <w:r>
-        <w:t xml:space="preserve"> busca ĝ(x) ≈ E[log1p(</w:t>
-      </w:r>
-      <w:proofErr w:type="spellStart"/>
-      <w:r>
-        <w:t>duration</w:t>
-      </w:r>
-      <w:proofErr w:type="spellEnd"/>
-      <w:r>
-        <w:t>) | x], minimizando el error cuadrático medio. En ambas, el reto es predecir meses futuros, no el periodo con el que se entrenó.</w:t>
+        <w:t xml:space="preserve"> busca ĝ(x) ≈ E[log1p(duration) | x], minimizando el error cuadrático medio. En ambas, el reto es predecir meses futuros, no el periodo con el que se entrenó.</w:t>
       </w:r>
     </w:p>
     <w:p>
@@ -1519,15 +1455,7 @@
           </w:tcPr>
           <w:p>
             <w:r>
-              <w:t xml:space="preserve">Descripción de la fuente y estructura de los datos; estadística descriptiva; visualizaciones pertinentes; análisis de distribuciones, valores atípicos, datos faltantes y relaciones entre variables; justificación de las transformaciones; prevención de fuga de información (data </w:t>
-            </w:r>
-            <w:proofErr w:type="spellStart"/>
-            <w:r>
-              <w:t>leakage</w:t>
-            </w:r>
-            <w:proofErr w:type="spellEnd"/>
-            <w:r>
-              <w:t>).</w:t>
+              <w:t>Descripción de la fuente y estructura de los datos; estadística descriptiva; visualizaciones pertinentes; análisis de distribuciones, valores atípicos, datos faltantes y relaciones entre variables; justificación de las transformaciones; prevención de fuga de información (data leakage).</w:t>
             </w:r>
           </w:p>
         </w:tc>
@@ -1599,23 +1527,7 @@
         <w:jc w:val="both"/>
       </w:pPr>
       <w:r>
-        <w:t>Los datos son el conjunto Bank Marketing con contexto social y económico del repositorio UCI (</w:t>
-      </w:r>
-      <w:proofErr w:type="spellStart"/>
-      <w:r>
-        <w:t>bank</w:t>
-      </w:r>
-      <w:proofErr w:type="spellEnd"/>
-      <w:r>
-        <w:t>-</w:t>
-      </w:r>
-      <w:proofErr w:type="spellStart"/>
-      <w:r>
-        <w:t>additional</w:t>
-      </w:r>
-      <w:proofErr w:type="spellEnd"/>
-      <w:r>
-        <w:t xml:space="preserve">-full, licencia CC BY 4.0): </w:t>
+        <w:t xml:space="preserve">Los datos son el conjunto Bank Marketing con contexto social y económico del repositorio UCI (bank-additional-full, licencia CC BY 4.0): </w:t>
       </w:r>
       <w:r>
         <w:rPr>
@@ -1625,47 +1537,7 @@
         <w:t>41 188 registros y 21 columnas</w:t>
       </w:r>
       <w:r>
-        <w:t xml:space="preserve">, de mayo de 2008 a noviembre de 2010. El archivo no trae el año, pero viene en orden cronológico, así que reconstruimos 26 periodos y 488 días de contacto. En la calidad de los datos eliminamos 12 duplicados exactos, con lo que quedan 41 176 registros; </w:t>
-      </w:r>
-      <w:proofErr w:type="spellStart"/>
-      <w:r>
-        <w:t>pdays</w:t>
-      </w:r>
-      <w:proofErr w:type="spellEnd"/>
-      <w:r>
-        <w:t xml:space="preserve"> = 999 aparece en el 96,3 % de los registros y no es una cantidad de días sino un código de «nunca contactado», por eso pasa a faltante con un indicador; y los valores </w:t>
-      </w:r>
-      <w:proofErr w:type="spellStart"/>
-      <w:r>
-        <w:t>unknown</w:t>
-      </w:r>
-      <w:proofErr w:type="spellEnd"/>
-      <w:r>
-        <w:t xml:space="preserve"> se conservan como categoría, porque se asocian con la variable objetivo. El inventario de atípicos, </w:t>
-      </w:r>
-      <w:proofErr w:type="spellStart"/>
-      <w:r>
-        <w:t>univariado</w:t>
-      </w:r>
-      <w:proofErr w:type="spellEnd"/>
-      <w:r>
-        <w:t xml:space="preserve"> y multivariado con </w:t>
-      </w:r>
-      <w:proofErr w:type="spellStart"/>
-      <w:r>
-        <w:t>Mahalanobis</w:t>
-      </w:r>
-      <w:proofErr w:type="spellEnd"/>
-      <w:r>
-        <w:t xml:space="preserve"> e </w:t>
-      </w:r>
-      <w:proofErr w:type="spellStart"/>
-      <w:r>
-        <w:t>Isolation</w:t>
-      </w:r>
-      <w:proofErr w:type="spellEnd"/>
-      <w:r>
-        <w:t xml:space="preserve"> Forest, está en las secciones 1.6.5 y 3.4.2 del cuaderno.</w:t>
+        <w:t>, de mayo de 2008 a noviembre de 2010. El archivo no trae el año, pero viene en orden cronológico, así que reconstruimos 26 periodos y 488 días de contacto. En la calidad de los datos eliminamos 12 duplicados exactos, con lo que quedan 41 176 registros; pdays = 999 aparece en el 96,3 % de los registros y no es una cantidad de días sino un código de «nunca contactado», por eso pasa a faltante con un indicador; y los valores unknown se conservan como categoría, porque se asocian con la variable objetivo. El inventario de atípicos, univariado y multivariado con Mahalanobis e Isolation Forest, está en las secciones 1.6.5 y 3.4.2 del cuaderno.</w:t>
       </w:r>
     </w:p>
     <w:p>
@@ -1684,15 +1556,7 @@
         <w:t>cambio de régimen</w:t>
       </w:r>
       <w:r>
-        <w:t xml:space="preserve">. En el entrenamiento suscribe el 6,4 % de los clientes y en la prueba el 30,8 %, casi cinco veces más. El banco pasó de unas 3 294 llamadas por mes a 484, la tasa </w:t>
-      </w:r>
-      <w:proofErr w:type="spellStart"/>
-      <w:r>
-        <w:t>euribor</w:t>
-      </w:r>
-      <w:proofErr w:type="spellEnd"/>
-      <w:r>
-        <w:t xml:space="preserve"> a tres meses cayó de un rango de 1,3 a 5,0 % a otro de 0,6 a 1,3 %, de modo que el 99 % de la prueba queda fuera del rango visto al entrenar, y los clientes contactados antes pasaron del 0,5 % al 16,3 %. Además, con validación aleatoria el modelo base logra un AUC de 0,670, pero un modelo que solo conoce el año y el mes ya llega a 0,660; con validación temporal el AUC cae a 0,540. Es decir, la validación aleatoria está inflada por fuga temporal.</w:t>
+        <w:t>. En el entrenamiento suscribe el 6,4 % de los clientes y en la prueba el 30,8 %, casi cinco veces más. El banco pasó de unas 3 294 llamadas por mes a 484, la tasa euribor a tres meses cayó de un rango de 1,3 a 5,0 % a otro de 0,6 a 1,3 %, de modo que el 99 % de la prueba queda fuera del rango visto al entrenar, y los clientes contactados antes pasaron del 0,5 % al 16,3 %. Además, con validación aleatoria el modelo base logra un AUC de 0,670, pero un modelo que solo conoce el año y el mes ya llega a 0,660; con validación temporal el AUC cae a 0,540. Es decir, la validación aleatoria está inflada por fuga temporal.</w:t>
       </w:r>
     </w:p>
     <w:p>
@@ -1701,39 +1565,7 @@
         <w:jc w:val="both"/>
       </w:pPr>
       <w:r>
-        <w:t xml:space="preserve">Por tal motivo, las transformaciones y la prevención de fuga se diseñaron con ese hallazgo. </w:t>
-      </w:r>
-      <w:proofErr w:type="spellStart"/>
-      <w:r>
-        <w:t>Duration</w:t>
-      </w:r>
-      <w:proofErr w:type="spellEnd"/>
-      <w:r>
-        <w:t xml:space="preserve"> se excluye de las predictoras, porque solo se conoce después de la llamada y su AUC </w:t>
-      </w:r>
-      <w:proofErr w:type="spellStart"/>
-      <w:r>
-        <w:t>univariado</w:t>
-      </w:r>
-      <w:proofErr w:type="spellEnd"/>
-      <w:r>
-        <w:t xml:space="preserve"> es de 0,914. El VIF retira euribor3m y </w:t>
-      </w:r>
-      <w:proofErr w:type="spellStart"/>
-      <w:r>
-        <w:t>emp.var.rate</w:t>
-      </w:r>
-      <w:proofErr w:type="spellEnd"/>
-      <w:r>
-        <w:t xml:space="preserve">, con valores de 46,2 y 45,4, sin pérdida apreciable de AUC. El escalado, la transformación log1p, la imputación y la codificación </w:t>
-      </w:r>
-      <w:proofErr w:type="spellStart"/>
-      <w:r>
-        <w:t>one-hot</w:t>
-      </w:r>
-      <w:proofErr w:type="spellEnd"/>
-      <w:r>
-        <w:t xml:space="preserve"> viven dentro de un Pipeline que se ajusta en cada pliegue, con lo que quedan 49 columnas. SMOTE y ADASYN también van dentro del Pipeline, de forma que solo actúan al entrenar. Por último, la partición es cronológica y la prueba se usa una sola vez.</w:t>
+        <w:t>Por tal motivo, las transformaciones y la prevención de fuga se diseñaron con ese hallazgo. Duration se excluye de las predictoras, porque solo se conoce después de la llamada y su AUC univariado es de 0,914. El VIF retira euribor3m y emp.var.rate, con valores de 46,2 y 45,4, sin pérdida apreciable de AUC. El escalado, la transformación log1p, la imputación y la codificación one-hot viven dentro de un Pipeline que se ajusta en cada pliegue, con lo que quedan 49 columnas. SMOTE y ADASYN también van dentro del Pipeline, de forma que solo actúan al entrenar. Por último, la partición es cronológica y la prueba se usa una sola vez.</w:t>
       </w:r>
     </w:p>
     <w:p>
@@ -1962,17 +1794,8 @@
           <w:b/>
           <w:bCs/>
         </w:rPr>
-        <w:t xml:space="preserve">SVM con aproximación de </w:t>
-      </w:r>
-      <w:proofErr w:type="spellStart"/>
-      <w:r>
-        <w:rPr>
-          <w:b/>
-          <w:bCs/>
-        </w:rPr>
-        <w:t>Nyström</w:t>
-      </w:r>
-      <w:proofErr w:type="spellEnd"/>
+        <w:t>SVM con aproximación de Nyström</w:t>
+      </w:r>
       <w:r>
         <w:t xml:space="preserve">, que tiene el mayor AUC; y los </w:t>
       </w:r>
@@ -2000,23 +1823,7 @@
         <w:t>Regresión logística.</w:t>
       </w:r>
       <w:r>
-        <w:t xml:space="preserve"> Modela el logaritmo de la razón de </w:t>
-      </w:r>
-      <w:proofErr w:type="spellStart"/>
-      <w:r>
-        <w:t>odds</w:t>
-      </w:r>
-      <w:proofErr w:type="spellEnd"/>
-      <w:r>
-        <w:t xml:space="preserve"> como una función lineal: p̂(x) = σ(β₀ + xᵀβ), con σ(z) = 1 / (1 + e^(−z)). Los coeficientes se estiman minimizando la pérdida logarítmica, −Σ [yᵢ log p̂ᵢ + (1 − yᵢ) log(1 − p̂ᵢ)], que equivale a maximizar la verosimilitud de una Bernoulli. La regularización L2 suma ‖β‖² / (2C) y encoge los coeficientes; la L1 suma un término proporcional a ‖β‖₁ y puede anular variables; el parámetro C controla la intensidad, y con C = 0,01 la regularización del modelo base es fuerte. El problema es convexo, así que el óptimo es global, y el solucionador SAGA lo resuelve con un costo lineal en n y p por iteración. Sus supuestos son la linealidad del </w:t>
-      </w:r>
-      <w:proofErr w:type="spellStart"/>
-      <w:r>
-        <w:t>logit</w:t>
-      </w:r>
-      <w:proofErr w:type="spellEnd"/>
-      <w:r>
-        <w:t>, la independencia de las observaciones y la ausencia de multicolinealidad perfecta, que es la razón del filtro VIF.</w:t>
+        <w:t xml:space="preserve"> Modela el logaritmo de la razón de odds como una función lineal: p̂(x) = σ(β₀ + xᵀβ), con σ(z) = 1 / (1 + e^(−z)). Los coeficientes se estiman minimizando la pérdida logarítmica, −Σ [yᵢ log p̂ᵢ + (1 − yᵢ) log(1 − p̂ᵢ)], que equivale a maximizar la verosimilitud de una Bernoulli. La regularización L2 suma ‖β‖² / (2C) y encoge los coeficientes; la L1 suma un término proporcional a ‖β‖₁ y puede anular variables; el parámetro C controla la intensidad, y con C = 0,01 la regularización del modelo base es fuerte. El problema es convexo, así que el óptimo es global, y el solucionador SAGA lo resuelve con un costo lineal en n y p por iteración. Sus supuestos son la linealidad del logit, la independencia de las observaciones y la ausencia de multicolinealidad perfecta, que es la razón del filtro VIF.</w:t>
       </w:r>
     </w:p>
     <w:p>
@@ -2032,90 +1839,17 @@
         <w:t>SVM.</w:t>
       </w:r>
       <w:r>
-        <w:t xml:space="preserve"> Busca el hiperplano de máximo margen minimizando ½‖w‖² + C Σ </w:t>
-      </w:r>
-      <w:proofErr w:type="spellStart"/>
-      <w:r>
-        <w:t>max</w:t>
-      </w:r>
-      <w:proofErr w:type="spellEnd"/>
-      <w:r>
-        <w:t xml:space="preserve">(0, 1 − yᵢ f(xᵢ)), es decir, la pérdida bisagra más un término de regularización. Con el núcleo RBF, k(x, x′) = </w:t>
-      </w:r>
-      <w:proofErr w:type="spellStart"/>
-      <w:r>
-        <w:t>exp</w:t>
-      </w:r>
-      <w:proofErr w:type="spellEnd"/>
-      <w:r>
-        <w:t>(−</w:t>
-      </w:r>
-      <w:proofErr w:type="spellStart"/>
-      <w:r>
-        <w:t>γ‖x</w:t>
-      </w:r>
-      <w:proofErr w:type="spellEnd"/>
-      <w:r>
-        <w:t xml:space="preserve"> − x′‖²), la frontera deja de ser lineal, pero el núcleo exacto exige una matriz de n × n, con un costo de memoria cuadrático y un tiempo entre cuadrático y cúbico. Por eso usamos la </w:t>
+        <w:t xml:space="preserve"> Busca el hiperplano de máximo margen minimizando ½‖w‖² + C Σ max(0, 1 − yᵢ f(xᵢ)), es decir, la pérdida bisagra más un término de regularización. Con el núcleo RBF, k(x, x′) = exp(−γ‖x − x′‖²), la frontera deja de ser lineal, pero el núcleo exacto exige una matriz de n × n, con un costo de memoria cuadrático y un tiempo entre cuadrático y cúbico. Por eso usamos la </w:t>
       </w:r>
       <w:r>
         <w:rPr>
           <w:b/>
           <w:bCs/>
         </w:rPr>
-        <w:t xml:space="preserve">aproximación de </w:t>
-      </w:r>
-      <w:proofErr w:type="spellStart"/>
-      <w:r>
-        <w:rPr>
-          <w:b/>
-          <w:bCs/>
-        </w:rPr>
-        <w:t>Nyström</w:t>
-      </w:r>
-      <w:proofErr w:type="spellEnd"/>
-      <w:r>
-        <w:t>: con m puntos de referencia construye una representación φ(x) de dimensión m cuyo producto interno aproxima el núcleo, a un costo de O(</w:t>
-      </w:r>
-      <w:proofErr w:type="spellStart"/>
-      <w:r>
-        <w:t>n·m·p</w:t>
-      </w:r>
-      <w:proofErr w:type="spellEnd"/>
-      <w:r>
-        <w:t xml:space="preserve"> + n·m² + m³), y sobre ella </w:t>
-      </w:r>
-      <w:proofErr w:type="spellStart"/>
-      <w:r>
-        <w:t>LinearSVC</w:t>
-      </w:r>
-      <w:proofErr w:type="spellEnd"/>
-      <w:r>
-        <w:t xml:space="preserve"> resuelve un problema lineal. Los </w:t>
-      </w:r>
-      <w:proofErr w:type="spellStart"/>
-      <w:r>
-        <w:t>hiperparámetros</w:t>
-      </w:r>
-      <w:proofErr w:type="spellEnd"/>
-      <w:r>
-        <w:t xml:space="preserve"> son γ, m y C, y </w:t>
-      </w:r>
-      <w:proofErr w:type="spellStart"/>
-      <w:r>
-        <w:t>class_weight</w:t>
-      </w:r>
-      <w:proofErr w:type="spellEnd"/>
-      <w:r>
-        <w:t xml:space="preserve"> </w:t>
-      </w:r>
-      <w:proofErr w:type="spellStart"/>
-      <w:r>
-        <w:t>reescala</w:t>
-      </w:r>
-      <w:proofErr w:type="spellEnd"/>
-      <w:r>
-        <w:t xml:space="preserve"> C por clase para compensar el desbalance. La SVM no produce probabilidades, así que se evalúa con su función de decisión, que basta para el AUC y el AUC-PR.</w:t>
+        <w:t>aproximación de Nyström</w:t>
+      </w:r>
+      <w:r>
+        <w:t>: con m puntos de referencia construye una representación φ(x) de dimensión m cuyo producto interno aproxima el núcleo, a un costo de O(n·m·p + n·m² + m³), y sobre ella LinearSVC resuelve un problema lineal. Los hiperparámetros son γ, m y C, y class_weight reescala C por clase para compensar el desbalance. La SVM no produce probabilidades, así que se evalúa con su función de decisión, que basta para el AUC y el AUC-PR.</w:t>
       </w:r>
     </w:p>
     <w:p>
@@ -2131,43 +1865,11 @@
         <w:t>Ensambles de árboles.</w:t>
       </w:r>
       <w:r>
-        <w:t xml:space="preserve"> </w:t>
-      </w:r>
-      <w:proofErr w:type="spellStart"/>
-      <w:r>
-        <w:t>Random</w:t>
-      </w:r>
-      <w:proofErr w:type="spellEnd"/>
-      <w:r>
-        <w:t xml:space="preserve"> Forest promedia B árboles entrenados sobre muestras </w:t>
-      </w:r>
-      <w:proofErr w:type="spellStart"/>
-      <w:r>
-        <w:t>bootstrap</w:t>
-      </w:r>
-      <w:proofErr w:type="spellEnd"/>
-      <w:r>
-        <w:t xml:space="preserve"> y subconjuntos aleatorios de variables; si cada árbol tiene varianza σ² y correlación ρ, la varianza del promedio es ρσ² + (1 − ρ)σ²/B, de modo que el ensamble reduce la varianza sin aumentar el sesgo. </w:t>
-      </w:r>
-      <w:proofErr w:type="spellStart"/>
-      <w:r>
-        <w:t>XGBoost</w:t>
-      </w:r>
-      <w:proofErr w:type="spellEnd"/>
-      <w:r>
-        <w:t xml:space="preserve"> </w:t>
+        <w:t xml:space="preserve"> Random Forest promedia B árboles entrenados sobre muestras bootstrap y subconjuntos aleatorios de variables; si cada árbol tiene varianza σ² y correlación ρ, la varianza del promedio es ρσ² + (1 − ρ)σ²/B, de modo que el ensamble reduce la varianza sin aumentar el sesgo. XGBoost </w:t>
       </w:r>
       <w:r>
         <w:lastRenderedPageBreak/>
-        <w:t xml:space="preserve">construye un modelo aditivo, ŷ = Σ fₖ(x), donde cada árbol corrige los errores de los anteriores; minimiza Σ l(yᵢ, ŷᵢ) + Σ Ω(fₖ), con Ω = </w:t>
-      </w:r>
-      <w:proofErr w:type="spellStart"/>
-      <w:r>
-        <w:t>γT</w:t>
-      </w:r>
-      <w:proofErr w:type="spellEnd"/>
-      <w:r>
-        <w:t xml:space="preserve"> + ½λ‖w‖², usa una aproximación de Taylor de segundo orden de la pérdida y obtiene el peso óptimo de cada hoja como w* = −G / (H + λ). La tasa de aprendizaje y el submuestreo actúan como regularización adicional.</w:t>
+        <w:t>construye un modelo aditivo, ŷ = Σ fₖ(x), donde cada árbol corrige los errores de los anteriores; minimiza Σ l(yᵢ, ŷᵢ) + Σ Ω(fₖ), con Ω = γT + ½λ‖w‖², usa una aproximación de Taylor de segundo orden de la pérdida y obtiene el peso óptimo de cada hoja como w* = −G / (H + λ). La tasa de aprendizaje y el submuestreo actúan como regularización adicional.</w:t>
       </w:r>
     </w:p>
     <w:p>
@@ -2186,31 +1888,7 @@
         <w:t>capacidad de generalización</w:t>
       </w:r>
       <w:r>
-        <w:t xml:space="preserve">, que en este problema es lo decisivo. Los árboles predicen con funciones constantes por tramos y no pueden extrapolar fuera del rango del entrenamiento; como el 99 % de la prueba tiene un </w:t>
-      </w:r>
-      <w:proofErr w:type="spellStart"/>
-      <w:r>
-        <w:t>euribor</w:t>
-      </w:r>
-      <w:proofErr w:type="spellEnd"/>
-      <w:r>
-        <w:t xml:space="preserve"> nunca visto, tratan a esos clientes como si estuvieran en el borde del rango. La logística regularizada, en cambio, extrapola de forma lineal y suave. La evidencia es clara: </w:t>
-      </w:r>
-      <w:proofErr w:type="spellStart"/>
-      <w:r>
-        <w:t>XGBoost</w:t>
-      </w:r>
-      <w:proofErr w:type="spellEnd"/>
-      <w:r>
-        <w:t xml:space="preserve"> tiene el mejor rango promedio en los pliegues externos (3,00), pero en la prueba de 2009-2010 queda último en AUC-PR (0,369). Así mismo, el supuesto de independencia e igual distribución entre entrenamiento y prueba no se cumple, y por eso la regularización fuerte pesa más que la flexibilidad. De los otros modelos basta decir que </w:t>
-      </w:r>
-      <w:proofErr w:type="spellStart"/>
-      <w:r>
-        <w:t>Naive</w:t>
-      </w:r>
-      <w:proofErr w:type="spellEnd"/>
-      <w:r>
-        <w:t xml:space="preserve"> Bayes supone independencia condicional y variables gaussianas, y KNN es no paramétrico y depende de la distancia, lo que lo hace sensible a la escala y a la dimensión.</w:t>
+        <w:t>, que en este problema es lo decisivo. Los árboles predicen con funciones constantes por tramos y no pueden extrapolar fuera del rango del entrenamiento; como el 99 % de la prueba tiene un euribor nunca visto, tratan a esos clientes como si estuvieran en el borde del rango. La logística regularizada, en cambio, extrapola de forma lineal y suave. La evidencia es clara: XGBoost tiene el mejor rango promedio en los pliegues externos (3,00), pero en la prueba de 2009-2010 queda último en AUC-PR (0,369). Así mismo, el supuesto de independencia e igual distribución entre entrenamiento y prueba no se cumple, y por eso la regularización fuerte pesa más que la flexibilidad. De los otros modelos basta decir que Naive Bayes supone independencia condicional y variables gaussianas, y KNN es no paramétrico y depende de la distancia, lo que lo hace sensible a la escala y a la dimensión.</w:t>
       </w:r>
     </w:p>
     <w:p>
@@ -2350,15 +2028,7 @@
           </w:tcPr>
           <w:p>
             <w:r>
-              <w:t xml:space="preserve">Correcta implementación del algoritmo; justificación de los </w:t>
-            </w:r>
-            <w:proofErr w:type="spellStart"/>
-            <w:r>
-              <w:t>hiperparámetros</w:t>
-            </w:r>
-            <w:proofErr w:type="spellEnd"/>
-            <w:r>
-              <w:t>; separación de los datos en entrenamiento, validación y prueba cuando corresponda; estrategia de validación; reproducibilidad; justificación de las decisiones computacionales.</w:t>
+              <w:t>Correcta implementación del algoritmo; justificación de los hiperparámetros; separación de los datos en entrenamiento, validación y prueba cuando corresponda; estrategia de validación; reproducibilidad; justificación de las decisiones computacionales.</w:t>
             </w:r>
           </w:p>
         </w:tc>
@@ -2460,23 +2130,7 @@
         <w:t>140</w:t>
       </w:r>
       <w:r>
-        <w:t xml:space="preserve">, un producto y no una suma. Todas salen de una sola función parametrizada que arma el Pipeline de </w:t>
-      </w:r>
-      <w:proofErr w:type="spellStart"/>
-      <w:r>
-        <w:t>imblearn</w:t>
-      </w:r>
-      <w:proofErr w:type="spellEnd"/>
-      <w:r>
-        <w:t xml:space="preserve"> (preprocesamiento, balanceo, </w:t>
-      </w:r>
-      <w:proofErr w:type="spellStart"/>
-      <w:r>
-        <w:t>Nyström</w:t>
-      </w:r>
-      <w:proofErr w:type="spellEnd"/>
-      <w:r>
-        <w:t xml:space="preserve"> en la SVM y modelo), así que todas usan el mismo preprocesamiento, sin fuga.</w:t>
+        <w:t>, un producto y no una suma. Todas salen de una sola función parametrizada que arma el Pipeline de imblearn (preprocesamiento, balanceo, Nyström en la SVM y modelo), así que todas usan el mismo preprocesamiento, sin fuga.</w:t>
       </w:r>
     </w:p>
     <w:p>
@@ -2515,23 +2169,7 @@
         <w:t>validación cruzada anidada</w:t>
       </w:r>
       <w:r>
-        <w:t xml:space="preserve"> con </w:t>
-      </w:r>
-      <w:proofErr w:type="spellStart"/>
-      <w:r>
-        <w:t>TimeSeriesSplit</w:t>
-      </w:r>
-      <w:proofErr w:type="spellEnd"/>
-      <w:r>
-        <w:t xml:space="preserve">: cinco pliegues externos de ventana creciente, que solo estiman el desempeño, y tres pliegues internos, donde cada optimizador elige los </w:t>
-      </w:r>
-      <w:proofErr w:type="spellStart"/>
-      <w:r>
-        <w:t>hiperparámetros</w:t>
-      </w:r>
-      <w:proofErr w:type="spellEnd"/>
-      <w:r>
-        <w:t>. Entre el ajuste y la validación dejamos una separación de 507 registros, el percentil 95 de los contactos por día, para que un mismo día no quede partido. Usamos cinco y tres pliegues porque el primer pliegue externo debe conservar cerca de 5 000 registros y cada bloque de validación, unos 5 500.</w:t>
+        <w:t xml:space="preserve"> con TimeSeriesSplit: cinco pliegues externos de ventana creciente, que solo estiman el desempeño, y tres pliegues internos, donde cada optimizador elige los hiperparámetros. Entre el ajuste y la validación dejamos una separación de 507 registros, el percentil 95 de los contactos por día, para que un mismo día no quede partido. Usamos cinco y tres pliegues porque el primer pliegue externo debe conservar cerca de 5 000 registros y cada bloque de validación, unos 5 500.</w:t>
       </w:r>
     </w:p>
     <w:p>
@@ -2540,23 +2178,7 @@
         <w:jc w:val="both"/>
       </w:pPr>
       <w:r>
-        <w:t xml:space="preserve">Cada modelo tiene un único espacio de búsqueda, compartido por los cuatro optimizadores, con hasta cuatro </w:t>
-      </w:r>
-      <w:proofErr w:type="spellStart"/>
-      <w:r>
-        <w:t>hiperparámetros</w:t>
-      </w:r>
-      <w:proofErr w:type="spellEnd"/>
-      <w:r>
-        <w:t xml:space="preserve"> y escalas logarítmicas donde el efecto es multiplicativo, como C, gamma o </w:t>
-      </w:r>
-      <w:proofErr w:type="spellStart"/>
-      <w:r>
-        <w:t>learning_rate</w:t>
-      </w:r>
-      <w:proofErr w:type="spellEnd"/>
-      <w:r>
-        <w:t xml:space="preserve">. Todos los métodos tienen el mismo presupuesto de </w:t>
+        <w:t xml:space="preserve">Cada modelo tiene un único espacio de búsqueda, compartido por los cuatro optimizadores, con hasta cuatro hiperparámetros y escalas logarítmicas donde el efecto es multiplicativo, como C, gamma o learning_rate. Todos los métodos tienen el mismo presupuesto de </w:t>
       </w:r>
       <w:r>
         <w:rPr>
@@ -2566,63 +2188,7 @@
         <w:t>20 configuraciones por pliegue</w:t>
       </w:r>
       <w:r>
-        <w:t xml:space="preserve">: </w:t>
-      </w:r>
-      <w:proofErr w:type="spellStart"/>
-      <w:r>
-        <w:t>Grid</w:t>
-      </w:r>
-      <w:proofErr w:type="spellEnd"/>
-      <w:r>
-        <w:t xml:space="preserve"> </w:t>
-      </w:r>
-      <w:proofErr w:type="spellStart"/>
-      <w:r>
-        <w:t>Search</w:t>
-      </w:r>
-      <w:proofErr w:type="spellEnd"/>
-      <w:r>
-        <w:t xml:space="preserve"> con una rejilla de a lo sumo 20 puntos, </w:t>
-      </w:r>
-      <w:proofErr w:type="spellStart"/>
-      <w:r>
-        <w:t>Random</w:t>
-      </w:r>
-      <w:proofErr w:type="spellEnd"/>
-      <w:r>
-        <w:t xml:space="preserve"> </w:t>
-      </w:r>
-      <w:proofErr w:type="spellStart"/>
-      <w:r>
-        <w:t>Search</w:t>
-      </w:r>
-      <w:proofErr w:type="spellEnd"/>
-      <w:r>
-        <w:t xml:space="preserve">, la bayesiana con </w:t>
-      </w:r>
-      <w:proofErr w:type="spellStart"/>
-      <w:r>
-        <w:t>Optuna</w:t>
-      </w:r>
-      <w:proofErr w:type="spellEnd"/>
-      <w:r>
-        <w:t xml:space="preserve"> (sustituto TPE y Mejora Esperada como función de adquisición) y el genético con DEAP (torneo de 3, cruce SBX con probabilidad 0,7, mutación polinomial con 0,3, élite de 1 y población de 6). Como técnica adicional, </w:t>
-      </w:r>
-      <w:proofErr w:type="spellStart"/>
-      <w:r>
-        <w:t>Successive</w:t>
-      </w:r>
-      <w:proofErr w:type="spellEnd"/>
-      <w:r>
-        <w:t xml:space="preserve"> </w:t>
-      </w:r>
-      <w:proofErr w:type="spellStart"/>
-      <w:r>
-        <w:t>Halving</w:t>
-      </w:r>
-      <w:proofErr w:type="spellEnd"/>
-      <w:r>
-        <w:t xml:space="preserve"> usa el número de árboles como fidelidad.</w:t>
+        <w:t>: Grid Search con una rejilla de a lo sumo 20 puntos, Random Search, la bayesiana con Optuna (sustituto TPE y Mejora Esperada como función de adquisición) y el genético con DEAP (torneo de 3, cruce SBX con probabilidad 0,7, mutación polinomial con 0,3, élite de 1 y población de 6). Como técnica adicional, Successive Halving usa el número de árboles como fidelidad.</w:t>
       </w:r>
     </w:p>
     <w:p>
@@ -2631,39 +2197,7 @@
         <w:jc w:val="both"/>
       </w:pPr>
       <w:r>
-        <w:t xml:space="preserve">En reproducibilidad, una semilla global (SEED = 42) se propaga a </w:t>
-      </w:r>
-      <w:proofErr w:type="spellStart"/>
-      <w:r>
-        <w:t>numpy</w:t>
-      </w:r>
-      <w:proofErr w:type="spellEnd"/>
-      <w:r>
-        <w:t xml:space="preserve">, </w:t>
-      </w:r>
-      <w:proofErr w:type="spellStart"/>
-      <w:r>
-        <w:t>scikit-learn</w:t>
-      </w:r>
-      <w:proofErr w:type="spellEnd"/>
-      <w:r>
-        <w:t xml:space="preserve">, </w:t>
-      </w:r>
-      <w:proofErr w:type="spellStart"/>
-      <w:r>
-        <w:t>XGBoost</w:t>
-      </w:r>
-      <w:proofErr w:type="spellEnd"/>
-      <w:r>
-        <w:t xml:space="preserve"> y DEAP; las versiones están fijadas en requirements.txt; y cada combinación queda registrada en una tabla maestra con sus </w:t>
-      </w:r>
-      <w:proofErr w:type="spellStart"/>
-      <w:r>
-        <w:t>hiperparámetros</w:t>
-      </w:r>
-      <w:proofErr w:type="spellEnd"/>
-      <w:r>
-        <w:t xml:space="preserve"> por pliegue, métricas, tiempos y semilla. El costo fue de </w:t>
+        <w:t xml:space="preserve">En reproducibilidad, una semilla global (SEED = 42) se propaga a numpy, scikit-learn, XGBoost y DEAP; las versiones están fijadas en requirements.txt; y cada combinación queda registrada en una tabla maestra con sus hiperparámetros por pliegue, métricas, tiempos y semilla. El costo fue de </w:t>
       </w:r>
       <w:r>
         <w:rPr>
@@ -2673,39 +2207,7 @@
         <w:t>13 730 evaluaciones internas, 41 890 ajustes y 29,9 horas de CPU</w:t>
       </w:r>
       <w:r>
-        <w:t xml:space="preserve">, viables gracias a 700 tareas </w:t>
-      </w:r>
-      <w:proofErr w:type="spellStart"/>
-      <w:r>
-        <w:t>reanudables</w:t>
-      </w:r>
-      <w:proofErr w:type="spellEnd"/>
-      <w:r>
-        <w:t xml:space="preserve"> en 10 procesos, histogramas en </w:t>
-      </w:r>
-      <w:proofErr w:type="spellStart"/>
-      <w:r>
-        <w:t>XGBoost</w:t>
-      </w:r>
-      <w:proofErr w:type="spellEnd"/>
-      <w:r>
-        <w:t xml:space="preserve"> (unas 10 veces más rápidos), </w:t>
-      </w:r>
-      <w:proofErr w:type="spellStart"/>
-      <w:r>
-        <w:t>Nyström</w:t>
-      </w:r>
-      <w:proofErr w:type="spellEnd"/>
-      <w:r>
-        <w:t xml:space="preserve"> en la SVM y SAGA en la logística; el perfilamiento ubicó el 69 % del tiempo en el ajuste de </w:t>
-      </w:r>
-      <w:proofErr w:type="spellStart"/>
-      <w:r>
-        <w:t>XGBoost</w:t>
-      </w:r>
-      <w:proofErr w:type="spellEnd"/>
-      <w:r>
-        <w:t>, por eso no hizo falta GPU ni cómputo distribuido.</w:t>
+        <w:t>, viables gracias a 700 tareas reanudables en 10 procesos, histogramas en XGBoost (unas 10 veces más rápidos), Nyström en la SVM y SAGA en la logística; el perfilamiento ubicó el 69 % del tiempo en el ajuste de XGBoost, por eso no hizo falta GPU ni cómputo distribuido.</w:t>
       </w:r>
     </w:p>
     <w:p>
@@ -2928,15 +2430,7 @@
         <w:t>AUC-PR</w:t>
       </w:r>
       <w:r>
-        <w:t xml:space="preserve">, porque la clase positiva es minoritaria, el uso real es ordenar a quién llamar y no depende del umbral, lo que permite comparar de forma justa modelos con y sin balanceo. Su línea base es la tasa de positivos: en la prueba, un modelo al azar obtendría 0,308. El </w:t>
-      </w:r>
-      <w:proofErr w:type="spellStart"/>
-      <w:r>
-        <w:t>accuracy</w:t>
-      </w:r>
-      <w:proofErr w:type="spellEnd"/>
-      <w:r>
-        <w:t>, en cambio, engaña: decir «no» a todos los clientes da un 69 % en la prueba.</w:t>
+        <w:t>, porque la clase positiva es minoritaria, el uso real es ordenar a quién llamar y no depende del umbral, lo que permite comparar de forma justa modelos con y sin balanceo. Su línea base es la tasa de positivos: en la prueba, un modelo al azar obtendría 0,308. El accuracy, en cambio, engaña: decir «no» a todos los clientes da un 69 % en la prueba.</w:t>
       </w:r>
     </w:p>
     <w:p>
@@ -2965,71 +2459,7 @@
         <w:t>0,548 [0,526; 0,568]</w:t>
       </w:r>
       <w:r>
-        <w:t xml:space="preserve">. La siguen la SVM con </w:t>
-      </w:r>
-      <w:proofErr w:type="spellStart"/>
-      <w:r>
-        <w:t>class_weight</w:t>
-      </w:r>
-      <w:proofErr w:type="spellEnd"/>
-      <w:r>
-        <w:t xml:space="preserve"> y </w:t>
-      </w:r>
-      <w:proofErr w:type="spellStart"/>
-      <w:r>
-        <w:t>Grid</w:t>
-      </w:r>
-      <w:proofErr w:type="spellEnd"/>
-      <w:r>
-        <w:t xml:space="preserve"> </w:t>
-      </w:r>
-      <w:proofErr w:type="spellStart"/>
-      <w:r>
-        <w:t>Search</w:t>
-      </w:r>
-      <w:proofErr w:type="spellEnd"/>
-      <w:r>
-        <w:t xml:space="preserve"> (0,538), </w:t>
-      </w:r>
-      <w:proofErr w:type="spellStart"/>
-      <w:r>
-        <w:t>Naive</w:t>
-      </w:r>
-      <w:proofErr w:type="spellEnd"/>
-      <w:r>
-        <w:t xml:space="preserve"> Bayes (0,534) y la logística L1/L2 con SMOTE (0,530); </w:t>
-      </w:r>
-      <w:proofErr w:type="spellStart"/>
-      <w:r>
-        <w:t>Random</w:t>
-      </w:r>
-      <w:proofErr w:type="spellEnd"/>
-      <w:r>
-        <w:t xml:space="preserve"> Forest y KNN quedan en 0,503 y 0,500, y el árbol y </w:t>
-      </w:r>
-      <w:proofErr w:type="spellStart"/>
-      <w:r>
-        <w:t>XGBoost</w:t>
-      </w:r>
-      <w:proofErr w:type="spellEnd"/>
-      <w:r>
-        <w:t xml:space="preserve"> en 0,374 y 0,369. Entre los siete finalistas, Friedman no encuentra diferencias (p = 0,787) y todos quedan dentro de la diferencia crítica de </w:t>
-      </w:r>
-      <w:proofErr w:type="spellStart"/>
-      <w:r>
-        <w:t>Nemenyi</w:t>
-      </w:r>
-      <w:proofErr w:type="spellEnd"/>
-      <w:r>
-        <w:t xml:space="preserve">. Con </w:t>
-      </w:r>
-      <w:proofErr w:type="spellStart"/>
-      <w:r>
-        <w:t>DeLong</w:t>
-      </w:r>
-      <w:proofErr w:type="spellEnd"/>
-      <w:r>
-        <w:t>, la SVM sí supera al modelo base en AUC por 0,014 (p de Holm &lt; 0,001), pero esa ventaja no llega a la parte alta de la lista, que es lo que mide el AUC-PR.</w:t>
+        <w:t>. La siguen la SVM con class_weight y Grid Search (0,538), Naive Bayes (0,534) y la logística L1/L2 con SMOTE (0,530); Random Forest y KNN quedan en 0,503 y 0,500, y el árbol y XGBoost en 0,374 y 0,369. Entre los siete finalistas, Friedman no encuentra diferencias (p = 0,787) y todos quedan dentro de la diferencia crítica de Nemenyi. Con DeLong, la SVM sí supera al modelo base en AUC por 0,014 (p de Holm &lt; 0,001), pero esa ventaja no llega a la parte alta de la lista, que es lo que mide el AUC-PR.</w:t>
       </w:r>
     </w:p>
     <w:p>
@@ -3117,7 +2547,6 @@
               <w:spacing w:before="20" w:after="20"/>
               <w:jc w:val="center"/>
             </w:pPr>
-            <w:proofErr w:type="spellStart"/>
             <w:r>
               <w:rPr>
                 <w:rFonts w:ascii="Times New Roman" w:eastAsia="Times New Roman" w:hAnsi="Times New Roman" w:cs="Times New Roman"/>
@@ -3125,7 +2554,6 @@
               </w:rPr>
               <w:t>Accuracy</w:t>
             </w:r>
-            <w:proofErr w:type="spellEnd"/>
           </w:p>
         </w:tc>
         <w:tc>
@@ -3143,7 +2571,6 @@
               <w:spacing w:before="20" w:after="20"/>
               <w:jc w:val="center"/>
             </w:pPr>
-            <w:proofErr w:type="spellStart"/>
             <w:r>
               <w:rPr>
                 <w:rFonts w:ascii="Times New Roman" w:eastAsia="Times New Roman" w:hAnsi="Times New Roman" w:cs="Times New Roman"/>
@@ -3151,7 +2578,6 @@
               </w:rPr>
               <w:t>Precision</w:t>
             </w:r>
-            <w:proofErr w:type="spellEnd"/>
           </w:p>
         </w:tc>
         <w:tc>
@@ -3169,7 +2595,6 @@
               <w:spacing w:before="20" w:after="20"/>
               <w:jc w:val="center"/>
             </w:pPr>
-            <w:proofErr w:type="spellStart"/>
             <w:r>
               <w:rPr>
                 <w:rFonts w:ascii="Times New Roman" w:eastAsia="Times New Roman" w:hAnsi="Times New Roman" w:cs="Times New Roman"/>
@@ -3177,7 +2602,6 @@
               </w:rPr>
               <w:t>Recall</w:t>
             </w:r>
-            <w:proofErr w:type="spellEnd"/>
           </w:p>
         </w:tc>
         <w:tc>
@@ -3448,23 +2872,7 @@
                 <w:rFonts w:ascii="Times New Roman" w:eastAsia="Times New Roman" w:hAnsi="Times New Roman" w:cs="Times New Roman"/>
                 <w:sz w:val="21"/>
               </w:rPr>
-              <w:t>SVM (</w:t>
-            </w:r>
-            <w:proofErr w:type="spellStart"/>
-            <w:r>
-              <w:rPr>
-                <w:rFonts w:ascii="Times New Roman" w:eastAsia="Times New Roman" w:hAnsi="Times New Roman" w:cs="Times New Roman"/>
-                <w:sz w:val="21"/>
-              </w:rPr>
-              <w:t>class_weight</w:t>
-            </w:r>
-            <w:proofErr w:type="spellEnd"/>
-            <w:r>
-              <w:rPr>
-                <w:rFonts w:ascii="Times New Roman" w:eastAsia="Times New Roman" w:hAnsi="Times New Roman" w:cs="Times New Roman"/>
-                <w:sz w:val="21"/>
-              </w:rPr>
-              <w:t>)</w:t>
+              <w:t>SVM (class_weight)</w:t>
             </w:r>
           </w:p>
         </w:tc>
@@ -3631,37 +3039,12 @@
             <w:pPr>
               <w:spacing w:before="20" w:after="20"/>
             </w:pPr>
-            <w:proofErr w:type="spellStart"/>
-            <w:r>
-              <w:rPr>
-                <w:rFonts w:ascii="Times New Roman" w:eastAsia="Times New Roman" w:hAnsi="Times New Roman" w:cs="Times New Roman"/>
-                <w:sz w:val="21"/>
-              </w:rPr>
-              <w:t>Naive</w:t>
-            </w:r>
-            <w:proofErr w:type="spellEnd"/>
-            <w:r>
-              <w:rPr>
-                <w:rFonts w:ascii="Times New Roman" w:eastAsia="Times New Roman" w:hAnsi="Times New Roman" w:cs="Times New Roman"/>
-                <w:sz w:val="21"/>
-              </w:rPr>
-              <w:t xml:space="preserve"> Bayes (</w:t>
-            </w:r>
-            <w:proofErr w:type="spellStart"/>
-            <w:r>
-              <w:rPr>
-                <w:rFonts w:ascii="Times New Roman" w:eastAsia="Times New Roman" w:hAnsi="Times New Roman" w:cs="Times New Roman"/>
-                <w:sz w:val="21"/>
-              </w:rPr>
-              <w:t>class_weight</w:t>
-            </w:r>
-            <w:proofErr w:type="spellEnd"/>
-            <w:r>
-              <w:rPr>
-                <w:rFonts w:ascii="Times New Roman" w:eastAsia="Times New Roman" w:hAnsi="Times New Roman" w:cs="Times New Roman"/>
-                <w:sz w:val="21"/>
-              </w:rPr>
-              <w:t>)</w:t>
+            <w:r>
+              <w:rPr>
+                <w:rFonts w:ascii="Times New Roman" w:eastAsia="Times New Roman" w:hAnsi="Times New Roman" w:cs="Times New Roman"/>
+                <w:sz w:val="21"/>
+              </w:rPr>
+              <w:t>Naive Bayes (class_weight)</w:t>
             </w:r>
           </w:p>
         </w:tc>
@@ -4000,21 +3383,12 @@
             <w:pPr>
               <w:spacing w:before="20" w:after="20"/>
             </w:pPr>
-            <w:proofErr w:type="spellStart"/>
-            <w:r>
-              <w:rPr>
-                <w:rFonts w:ascii="Times New Roman" w:eastAsia="Times New Roman" w:hAnsi="Times New Roman" w:cs="Times New Roman"/>
-                <w:sz w:val="21"/>
-              </w:rPr>
-              <w:t>Random</w:t>
-            </w:r>
-            <w:proofErr w:type="spellEnd"/>
-            <w:r>
-              <w:rPr>
-                <w:rFonts w:ascii="Times New Roman" w:eastAsia="Times New Roman" w:hAnsi="Times New Roman" w:cs="Times New Roman"/>
-                <w:sz w:val="21"/>
-              </w:rPr>
-              <w:t xml:space="preserve"> Forest (sin balanceo)</w:t>
+            <w:r>
+              <w:rPr>
+                <w:rFonts w:ascii="Times New Roman" w:eastAsia="Times New Roman" w:hAnsi="Times New Roman" w:cs="Times New Roman"/>
+                <w:sz w:val="21"/>
+              </w:rPr>
+              <w:t>Random Forest (sin balanceo)</w:t>
             </w:r>
           </w:p>
         </w:tc>
@@ -4187,23 +3561,7 @@
                 <w:sz w:val="21"/>
               </w:rPr>
               <w:lastRenderedPageBreak/>
-              <w:t>KNN (</w:t>
-            </w:r>
-            <w:proofErr w:type="spellStart"/>
-            <w:r>
-              <w:rPr>
-                <w:rFonts w:ascii="Times New Roman" w:eastAsia="Times New Roman" w:hAnsi="Times New Roman" w:cs="Times New Roman"/>
-                <w:sz w:val="21"/>
-              </w:rPr>
-              <w:t>class_weight</w:t>
-            </w:r>
-            <w:proofErr w:type="spellEnd"/>
-            <w:r>
-              <w:rPr>
-                <w:rFonts w:ascii="Times New Roman" w:eastAsia="Times New Roman" w:hAnsi="Times New Roman" w:cs="Times New Roman"/>
-                <w:sz w:val="21"/>
-              </w:rPr>
-              <w:t>)</w:t>
+              <w:t>KNN (class_weight)</w:t>
             </w:r>
           </w:p>
         </w:tc>
@@ -4542,37 +3900,12 @@
             <w:pPr>
               <w:spacing w:before="20" w:after="20"/>
             </w:pPr>
-            <w:proofErr w:type="spellStart"/>
-            <w:r>
-              <w:rPr>
-                <w:rFonts w:ascii="Times New Roman" w:eastAsia="Times New Roman" w:hAnsi="Times New Roman" w:cs="Times New Roman"/>
-                <w:sz w:val="21"/>
-              </w:rPr>
-              <w:t>XGBoost</w:t>
-            </w:r>
-            <w:proofErr w:type="spellEnd"/>
-            <w:r>
-              <w:rPr>
-                <w:rFonts w:ascii="Times New Roman" w:eastAsia="Times New Roman" w:hAnsi="Times New Roman" w:cs="Times New Roman"/>
-                <w:sz w:val="21"/>
-              </w:rPr>
-              <w:t xml:space="preserve"> (</w:t>
-            </w:r>
-            <w:proofErr w:type="spellStart"/>
-            <w:r>
-              <w:rPr>
-                <w:rFonts w:ascii="Times New Roman" w:eastAsia="Times New Roman" w:hAnsi="Times New Roman" w:cs="Times New Roman"/>
-                <w:sz w:val="21"/>
-              </w:rPr>
-              <w:t>class_weight</w:t>
-            </w:r>
-            <w:proofErr w:type="spellEnd"/>
-            <w:r>
-              <w:rPr>
-                <w:rFonts w:ascii="Times New Roman" w:eastAsia="Times New Roman" w:hAnsi="Times New Roman" w:cs="Times New Roman"/>
-                <w:sz w:val="21"/>
-              </w:rPr>
-              <w:t>)</w:t>
+            <w:r>
+              <w:rPr>
+                <w:rFonts w:ascii="Times New Roman" w:eastAsia="Times New Roman" w:hAnsi="Times New Roman" w:cs="Times New Roman"/>
+                <w:sz w:val="21"/>
+              </w:rPr>
+              <w:t>XGBoost (class_weight)</w:t>
             </w:r>
           </w:p>
         </w:tc>
@@ -5035,23 +4368,7 @@
           <w:rFonts w:ascii="Times New Roman" w:eastAsia="Times New Roman" w:hAnsi="Times New Roman" w:cs="Times New Roman"/>
           <w:sz w:val="21"/>
         </w:rPr>
-        <w:t xml:space="preserve">Cuadro 3: Comparación dirigida por pares (subconjunto reducido) de modelos de clasificación mediante el test de </w:t>
-      </w:r>
-      <w:proofErr w:type="spellStart"/>
-      <w:r>
-        <w:rPr>
-          <w:rFonts w:ascii="Times New Roman" w:eastAsia="Times New Roman" w:hAnsi="Times New Roman" w:cs="Times New Roman"/>
-          <w:sz w:val="21"/>
-        </w:rPr>
-        <w:t>DeLong</w:t>
-      </w:r>
-      <w:proofErr w:type="spellEnd"/>
-      <w:r>
-        <w:rPr>
-          <w:rFonts w:ascii="Times New Roman" w:eastAsia="Times New Roman" w:hAnsi="Times New Roman" w:cs="Times New Roman"/>
-          <w:sz w:val="21"/>
-        </w:rPr>
-        <w:t>, con corrección de Holm-Bonferroni</w:t>
+        <w:t>Cuadro 3: Comparación dirigida por pares (subconjunto reducido) de modelos de clasificación mediante el test de DeLong, con corrección de Holm-Bonferroni</w:t>
       </w:r>
       <w:r>
         <w:rPr>
@@ -5176,17 +4493,8 @@
                 <w:rFonts w:ascii="Times New Roman" w:eastAsia="Times New Roman" w:hAnsi="Times New Roman" w:cs="Times New Roman"/>
                 <w:sz w:val="21"/>
               </w:rPr>
-              <w:t xml:space="preserve">IC 95 % </w:t>
-            </w:r>
-            <w:proofErr w:type="spellStart"/>
-            <w:r>
-              <w:rPr>
-                <w:rFonts w:ascii="Times New Roman" w:eastAsia="Times New Roman" w:hAnsi="Times New Roman" w:cs="Times New Roman"/>
-                <w:sz w:val="21"/>
-              </w:rPr>
-              <w:t>bootstrap</w:t>
-            </w:r>
-            <w:proofErr w:type="spellEnd"/>
+              <w:t>IC 95 % bootstrap</w:t>
+            </w:r>
           </w:p>
         </w:tc>
         <w:tc>
@@ -5295,21 +4603,12 @@
             <w:pPr>
               <w:spacing w:before="20" w:after="20"/>
             </w:pPr>
-            <w:proofErr w:type="spellStart"/>
-            <w:r>
-              <w:rPr>
-                <w:rFonts w:ascii="Times New Roman" w:eastAsia="Times New Roman" w:hAnsi="Times New Roman" w:cs="Times New Roman"/>
-                <w:sz w:val="21"/>
-              </w:rPr>
-              <w:t>Random</w:t>
-            </w:r>
-            <w:proofErr w:type="spellEnd"/>
-            <w:r>
-              <w:rPr>
-                <w:rFonts w:ascii="Times New Roman" w:eastAsia="Times New Roman" w:hAnsi="Times New Roman" w:cs="Times New Roman"/>
-                <w:sz w:val="21"/>
-              </w:rPr>
-              <w:t xml:space="preserve"> Forest</w:t>
+            <w:r>
+              <w:rPr>
+                <w:rFonts w:ascii="Times New Roman" w:eastAsia="Times New Roman" w:hAnsi="Times New Roman" w:cs="Times New Roman"/>
+                <w:sz w:val="21"/>
+              </w:rPr>
+              <w:t>Random Forest</w:t>
             </w:r>
           </w:p>
         </w:tc>
@@ -5451,21 +4750,12 @@
             <w:pPr>
               <w:spacing w:before="20" w:after="20"/>
             </w:pPr>
-            <w:proofErr w:type="spellStart"/>
-            <w:r>
-              <w:rPr>
-                <w:rFonts w:ascii="Times New Roman" w:eastAsia="Times New Roman" w:hAnsi="Times New Roman" w:cs="Times New Roman"/>
-                <w:sz w:val="21"/>
-              </w:rPr>
-              <w:t>Naive</w:t>
-            </w:r>
-            <w:proofErr w:type="spellEnd"/>
-            <w:r>
-              <w:rPr>
-                <w:rFonts w:ascii="Times New Roman" w:eastAsia="Times New Roman" w:hAnsi="Times New Roman" w:cs="Times New Roman"/>
-                <w:sz w:val="21"/>
-              </w:rPr>
-              <w:t xml:space="preserve"> Bayes</w:t>
+            <w:r>
+              <w:rPr>
+                <w:rFonts w:ascii="Times New Roman" w:eastAsia="Times New Roman" w:hAnsi="Times New Roman" w:cs="Times New Roman"/>
+                <w:sz w:val="21"/>
+              </w:rPr>
+              <w:t>Naive Bayes</w:t>
             </w:r>
           </w:p>
         </w:tc>
@@ -5584,21 +4874,12 @@
             <w:pPr>
               <w:spacing w:before="20" w:after="20"/>
             </w:pPr>
-            <w:proofErr w:type="spellStart"/>
-            <w:r>
-              <w:rPr>
-                <w:rFonts w:ascii="Times New Roman" w:eastAsia="Times New Roman" w:hAnsi="Times New Roman" w:cs="Times New Roman"/>
-                <w:sz w:val="21"/>
-              </w:rPr>
-              <w:t>Random</w:t>
-            </w:r>
-            <w:proofErr w:type="spellEnd"/>
-            <w:r>
-              <w:rPr>
-                <w:rFonts w:ascii="Times New Roman" w:eastAsia="Times New Roman" w:hAnsi="Times New Roman" w:cs="Times New Roman"/>
-                <w:sz w:val="21"/>
-              </w:rPr>
-              <w:t xml:space="preserve"> Forest</w:t>
+            <w:r>
+              <w:rPr>
+                <w:rFonts w:ascii="Times New Roman" w:eastAsia="Times New Roman" w:hAnsi="Times New Roman" w:cs="Times New Roman"/>
+                <w:sz w:val="21"/>
+              </w:rPr>
+              <w:t>Random Forest</w:t>
             </w:r>
           </w:p>
         </w:tc>
@@ -5616,21 +4897,12 @@
             <w:pPr>
               <w:spacing w:before="20" w:after="20"/>
             </w:pPr>
-            <w:proofErr w:type="spellStart"/>
-            <w:r>
-              <w:rPr>
-                <w:rFonts w:ascii="Times New Roman" w:eastAsia="Times New Roman" w:hAnsi="Times New Roman" w:cs="Times New Roman"/>
-                <w:sz w:val="21"/>
-              </w:rPr>
-              <w:t>Naive</w:t>
-            </w:r>
-            <w:proofErr w:type="spellEnd"/>
-            <w:r>
-              <w:rPr>
-                <w:rFonts w:ascii="Times New Roman" w:eastAsia="Times New Roman" w:hAnsi="Times New Roman" w:cs="Times New Roman"/>
-                <w:sz w:val="21"/>
-              </w:rPr>
-              <w:t xml:space="preserve"> Bayes</w:t>
+            <w:r>
+              <w:rPr>
+                <w:rFonts w:ascii="Times New Roman" w:eastAsia="Times New Roman" w:hAnsi="Times New Roman" w:cs="Times New Roman"/>
+                <w:sz w:val="21"/>
+              </w:rPr>
+              <w:t>Naive Bayes</w:t>
             </w:r>
           </w:p>
         </w:tc>
@@ -5895,47 +5167,7 @@
         <w:t>análisis de errores</w:t>
       </w:r>
       <w:r>
-        <w:t xml:space="preserve"> muestra que el umbral de 0,5, aprendido con un 6,4 % de positivos, no sirve cuando hay un 30,8 %: </w:t>
-      </w:r>
-      <w:proofErr w:type="spellStart"/>
-      <w:r>
-        <w:t>Random</w:t>
-      </w:r>
-      <w:proofErr w:type="spellEnd"/>
-      <w:r>
-        <w:t xml:space="preserve"> Forest casi nunca dice «sí» (</w:t>
-      </w:r>
-      <w:proofErr w:type="spellStart"/>
-      <w:r>
-        <w:t>recall</w:t>
-      </w:r>
-      <w:proofErr w:type="spellEnd"/>
-      <w:r>
-        <w:t xml:space="preserve"> de 0,001) y el modelo base solo encuentra al 8,7 % de los que suscriben. Los modelos balanceados están en el otro extremo, con </w:t>
-      </w:r>
-      <w:proofErr w:type="spellStart"/>
-      <w:r>
-        <w:t>recall</w:t>
-      </w:r>
-      <w:proofErr w:type="spellEnd"/>
-      <w:r>
-        <w:t xml:space="preserve"> de 0,84 a 0,94 y precisión de 0,33 a 0,38. El balanceo, entonces, solo desplaza el umbral: sube el </w:t>
-      </w:r>
-      <w:proofErr w:type="spellStart"/>
-      <w:r>
-        <w:t>recall</w:t>
-      </w:r>
-      <w:proofErr w:type="spellEnd"/>
-      <w:r>
-        <w:t xml:space="preserve"> medio de 0,047 a entre 0,39 y 0,52 sin mejorar el AUC-PR, y empeora el </w:t>
-      </w:r>
-      <w:proofErr w:type="spellStart"/>
-      <w:r>
-        <w:t>Brier</w:t>
-      </w:r>
-      <w:proofErr w:type="spellEnd"/>
-      <w:r>
-        <w:t>. Lo que sí corrige el desajuste es la recalibración mensual del intercepto, que baja el ECE mediano de 0,189 a 0,055.</w:t>
+        <w:t xml:space="preserve"> muestra que el umbral de 0,5, aprendido con un 6,4 % de positivos, no sirve cuando hay un 30,8 %: Random Forest casi nunca dice «sí» (recall de 0,001) y el modelo base solo encuentra al 8,7 % de los que suscriben. Los modelos balanceados están en el otro extremo, con recall de 0,84 a 0,94 y precisión de 0,33 a 0,38. El balanceo, entonces, solo desplaza el umbral: sube el recall medio de 0,047 a entre 0,39 y 0,52 sin mejorar el AUC-PR, y empeora el Brier. Lo que sí corrige el desajuste es la recalibración mensual del intercepto, que baja el ECE mediano de 0,189 a 0,055.</w:t>
       </w:r>
     </w:p>
     <w:p>
@@ -8399,39 +7631,7 @@
         <w:t>sobreajuste</w:t>
       </w:r>
       <w:r>
-        <w:t xml:space="preserve">, el diagnóstico es un sobreajuste al régimen de 2008: </w:t>
-      </w:r>
-      <w:proofErr w:type="spellStart"/>
-      <w:r>
-        <w:t>XGBoost</w:t>
-      </w:r>
-      <w:proofErr w:type="spellEnd"/>
-      <w:r>
-        <w:t xml:space="preserve"> es el mejor en los pliegues externos y el último en la prueba. En coherencia con el objetivo, el mejor modelo ordena a los clientes 1,8 veces mejor que el azar, y SHAP indica que pesan el historial de contacto (el indicador de </w:t>
-      </w:r>
-      <w:proofErr w:type="spellStart"/>
-      <w:r>
-        <w:t>pdays</w:t>
-      </w:r>
-      <w:proofErr w:type="spellEnd"/>
-      <w:r>
-        <w:t xml:space="preserve">, con 0,159, y </w:t>
-      </w:r>
-      <w:proofErr w:type="spellStart"/>
-      <w:r>
-        <w:t>previous</w:t>
-      </w:r>
-      <w:proofErr w:type="spellEnd"/>
-      <w:r>
-        <w:t>, con 0,124) y el contexto económico (</w:t>
-      </w:r>
-      <w:proofErr w:type="spellStart"/>
-      <w:r>
-        <w:t>cons.conf.idx</w:t>
-      </w:r>
-      <w:proofErr w:type="spellEnd"/>
-      <w:r>
-        <w:t>, con 0,125), no el perfil del cliente. En regresión, el mejor R² es 0,088.</w:t>
+        <w:t>, el diagnóstico es un sobreajuste al régimen de 2008: XGBoost es el mejor en los pliegues externos y el último en la prueba. En coherencia con el objetivo, el mejor modelo ordena a los clientes 1,8 veces mejor que el azar, y SHAP indica que pesan el historial de contacto (el indicador de pdays, con 0,159, y previous, con 0,124) y el contexto económico (cons.conf.idx, con 0,125), no el perfil del cliente. En regresión, el mejor R² es 0,088.</w:t>
       </w:r>
     </w:p>
     <w:p>
@@ -8658,21 +7858,12 @@
             <w:pPr>
               <w:spacing w:before="20" w:after="20"/>
             </w:pPr>
-            <w:proofErr w:type="spellStart"/>
-            <w:r>
-              <w:rPr>
-                <w:rFonts w:ascii="Times New Roman" w:eastAsia="Times New Roman" w:hAnsi="Times New Roman" w:cs="Times New Roman"/>
-                <w:sz w:val="21"/>
-              </w:rPr>
-              <w:t>Random</w:t>
-            </w:r>
-            <w:proofErr w:type="spellEnd"/>
-            <w:r>
-              <w:rPr>
-                <w:rFonts w:ascii="Times New Roman" w:eastAsia="Times New Roman" w:hAnsi="Times New Roman" w:cs="Times New Roman"/>
-                <w:sz w:val="21"/>
-              </w:rPr>
-              <w:t xml:space="preserve"> Forest</w:t>
+            <w:r>
+              <w:rPr>
+                <w:rFonts w:ascii="Times New Roman" w:eastAsia="Times New Roman" w:hAnsi="Times New Roman" w:cs="Times New Roman"/>
+                <w:sz w:val="21"/>
+              </w:rPr>
+              <w:t>Random Forest</w:t>
             </w:r>
           </w:p>
         </w:tc>
@@ -8963,7 +8154,6 @@
             <w:pPr>
               <w:spacing w:before="20" w:after="20"/>
             </w:pPr>
-            <w:proofErr w:type="spellStart"/>
             <w:r>
               <w:rPr>
                 <w:rFonts w:ascii="Times New Roman" w:eastAsia="Times New Roman" w:hAnsi="Times New Roman" w:cs="Times New Roman"/>
@@ -8971,7 +8161,6 @@
               </w:rPr>
               <w:t>XGBoost</w:t>
             </w:r>
-            <w:proofErr w:type="spellEnd"/>
           </w:p>
         </w:tc>
         <w:tc>
@@ -9848,39 +9037,7 @@
           <w:sz w:val="21"/>
         </w:rPr>
         <w:lastRenderedPageBreak/>
-        <w:t xml:space="preserve">Cuadro 6: </w:t>
-      </w:r>
-      <w:proofErr w:type="spellStart"/>
-      <w:r>
-        <w:rPr>
-          <w:rFonts w:ascii="Times New Roman" w:eastAsia="Times New Roman" w:hAnsi="Times New Roman" w:cs="Times New Roman"/>
-          <w:sz w:val="21"/>
-        </w:rPr>
-        <w:t>Model</w:t>
-      </w:r>
-      <w:proofErr w:type="spellEnd"/>
-      <w:r>
-        <w:rPr>
-          <w:rFonts w:ascii="Times New Roman" w:eastAsia="Times New Roman" w:hAnsi="Times New Roman" w:cs="Times New Roman"/>
-          <w:sz w:val="21"/>
-        </w:rPr>
-        <w:t xml:space="preserve"> </w:t>
-      </w:r>
-      <w:proofErr w:type="spellStart"/>
-      <w:r>
-        <w:rPr>
-          <w:rFonts w:ascii="Times New Roman" w:eastAsia="Times New Roman" w:hAnsi="Times New Roman" w:cs="Times New Roman"/>
-          <w:sz w:val="21"/>
-        </w:rPr>
-        <w:t>Confidence</w:t>
-      </w:r>
-      <w:proofErr w:type="spellEnd"/>
-      <w:r>
-        <w:rPr>
-          <w:rFonts w:ascii="Times New Roman" w:eastAsia="Times New Roman" w:hAnsi="Times New Roman" w:cs="Times New Roman"/>
-          <w:sz w:val="21"/>
-        </w:rPr>
-        <w:t xml:space="preserve"> Set (MCS) sobre las 28 combinaciones de regresión más la media histórica, α = 0,10 (mejor optimizador de cada familia)</w:t>
+        <w:t>Cuadro 6: Model Confidence Set (MCS) sobre las 28 combinaciones de regresión más la media histórica, α = 0,10 (mejor optimizador de cada familia)</w:t>
       </w:r>
       <w:r>
         <w:rPr>
@@ -10035,37 +9192,12 @@
             <w:pPr>
               <w:spacing w:before="20" w:after="20"/>
             </w:pPr>
-            <w:proofErr w:type="spellStart"/>
-            <w:r>
-              <w:rPr>
-                <w:rFonts w:ascii="Times New Roman" w:eastAsia="Times New Roman" w:hAnsi="Times New Roman" w:cs="Times New Roman"/>
-                <w:sz w:val="21"/>
-              </w:rPr>
-              <w:t>XGBoost</w:t>
-            </w:r>
-            <w:proofErr w:type="spellEnd"/>
-            <w:r>
-              <w:rPr>
-                <w:rFonts w:ascii="Times New Roman" w:eastAsia="Times New Roman" w:hAnsi="Times New Roman" w:cs="Times New Roman"/>
-                <w:sz w:val="21"/>
-              </w:rPr>
-              <w:t xml:space="preserve"> · Bayesiana (</w:t>
-            </w:r>
-            <w:proofErr w:type="spellStart"/>
-            <w:r>
-              <w:rPr>
-                <w:rFonts w:ascii="Times New Roman" w:eastAsia="Times New Roman" w:hAnsi="Times New Roman" w:cs="Times New Roman"/>
-                <w:sz w:val="21"/>
-              </w:rPr>
-              <w:t>Optuna</w:t>
-            </w:r>
-            <w:proofErr w:type="spellEnd"/>
-            <w:r>
-              <w:rPr>
-                <w:rFonts w:ascii="Times New Roman" w:eastAsia="Times New Roman" w:hAnsi="Times New Roman" w:cs="Times New Roman"/>
-                <w:sz w:val="21"/>
-              </w:rPr>
-              <w:t xml:space="preserve"> TPE)</w:t>
+            <w:r>
+              <w:rPr>
+                <w:rFonts w:ascii="Times New Roman" w:eastAsia="Times New Roman" w:hAnsi="Times New Roman" w:cs="Times New Roman"/>
+                <w:sz w:val="21"/>
+              </w:rPr>
+              <w:t>XGBoost · Bayesiana (Optuna TPE)</w:t>
             </w:r>
           </w:p>
         </w:tc>
@@ -10160,47 +9292,13 @@
             <w:pPr>
               <w:spacing w:before="20" w:after="20"/>
             </w:pPr>
-            <w:proofErr w:type="spellStart"/>
-            <w:r>
-              <w:rPr>
-                <w:rFonts w:ascii="Times New Roman" w:eastAsia="Times New Roman" w:hAnsi="Times New Roman" w:cs="Times New Roman"/>
-                <w:sz w:val="21"/>
-              </w:rPr>
-              <w:t>Random</w:t>
-            </w:r>
-            <w:proofErr w:type="spellEnd"/>
-            <w:r>
-              <w:rPr>
-                <w:rFonts w:ascii="Times New Roman" w:eastAsia="Times New Roman" w:hAnsi="Times New Roman" w:cs="Times New Roman"/>
-                <w:sz w:val="21"/>
-              </w:rPr>
-              <w:t xml:space="preserve"> Forest · </w:t>
-            </w:r>
-            <w:proofErr w:type="spellStart"/>
-            <w:r>
-              <w:rPr>
-                <w:rFonts w:ascii="Times New Roman" w:eastAsia="Times New Roman" w:hAnsi="Times New Roman" w:cs="Times New Roman"/>
-                <w:sz w:val="21"/>
-              </w:rPr>
-              <w:t>Random</w:t>
-            </w:r>
-            <w:proofErr w:type="spellEnd"/>
-            <w:r>
-              <w:rPr>
-                <w:rFonts w:ascii="Times New Roman" w:eastAsia="Times New Roman" w:hAnsi="Times New Roman" w:cs="Times New Roman"/>
-                <w:sz w:val="21"/>
-              </w:rPr>
-              <w:t xml:space="preserve"> </w:t>
-            </w:r>
-            <w:proofErr w:type="spellStart"/>
-            <w:r>
-              <w:rPr>
-                <w:rFonts w:ascii="Times New Roman" w:eastAsia="Times New Roman" w:hAnsi="Times New Roman" w:cs="Times New Roman"/>
-                <w:sz w:val="21"/>
-              </w:rPr>
-              <w:t>Search</w:t>
-            </w:r>
-            <w:proofErr w:type="spellEnd"/>
+            <w:r>
+              <w:rPr>
+                <w:rFonts w:ascii="Times New Roman" w:eastAsia="Times New Roman" w:hAnsi="Times New Roman" w:cs="Times New Roman"/>
+                <w:sz w:val="21"/>
+              </w:rPr>
+              <w:t>Random Forest · Random Search</w:t>
+            </w:r>
           </w:p>
         </w:tc>
         <w:tc>
@@ -10299,33 +9397,8 @@
                 <w:rFonts w:ascii="Times New Roman" w:eastAsia="Times New Roman" w:hAnsi="Times New Roman" w:cs="Times New Roman"/>
                 <w:sz w:val="21"/>
               </w:rPr>
-              <w:t xml:space="preserve">Árbol de decisión · </w:t>
-            </w:r>
-            <w:proofErr w:type="spellStart"/>
-            <w:r>
-              <w:rPr>
-                <w:rFonts w:ascii="Times New Roman" w:eastAsia="Times New Roman" w:hAnsi="Times New Roman" w:cs="Times New Roman"/>
-                <w:sz w:val="21"/>
-              </w:rPr>
-              <w:t>Grid</w:t>
-            </w:r>
-            <w:proofErr w:type="spellEnd"/>
-            <w:r>
-              <w:rPr>
-                <w:rFonts w:ascii="Times New Roman" w:eastAsia="Times New Roman" w:hAnsi="Times New Roman" w:cs="Times New Roman"/>
-                <w:sz w:val="21"/>
-              </w:rPr>
-              <w:t xml:space="preserve"> </w:t>
-            </w:r>
-            <w:proofErr w:type="spellStart"/>
-            <w:r>
-              <w:rPr>
-                <w:rFonts w:ascii="Times New Roman" w:eastAsia="Times New Roman" w:hAnsi="Times New Roman" w:cs="Times New Roman"/>
-                <w:sz w:val="21"/>
-              </w:rPr>
-              <w:t>Search</w:t>
-            </w:r>
-            <w:proofErr w:type="spellEnd"/>
+              <w:t>Árbol de decisión · Grid Search</w:t>
+            </w:r>
           </w:p>
         </w:tc>
         <w:tc>
@@ -10524,33 +9597,8 @@
                 <w:rFonts w:ascii="Times New Roman" w:eastAsia="Times New Roman" w:hAnsi="Times New Roman" w:cs="Times New Roman"/>
                 <w:sz w:val="21"/>
               </w:rPr>
-              <w:t xml:space="preserve">Ridge · </w:t>
-            </w:r>
-            <w:proofErr w:type="spellStart"/>
-            <w:r>
-              <w:rPr>
-                <w:rFonts w:ascii="Times New Roman" w:eastAsia="Times New Roman" w:hAnsi="Times New Roman" w:cs="Times New Roman"/>
-                <w:sz w:val="21"/>
-              </w:rPr>
-              <w:t>Random</w:t>
-            </w:r>
-            <w:proofErr w:type="spellEnd"/>
-            <w:r>
-              <w:rPr>
-                <w:rFonts w:ascii="Times New Roman" w:eastAsia="Times New Roman" w:hAnsi="Times New Roman" w:cs="Times New Roman"/>
-                <w:sz w:val="21"/>
-              </w:rPr>
-              <w:t xml:space="preserve"> </w:t>
-            </w:r>
-            <w:proofErr w:type="spellStart"/>
-            <w:r>
-              <w:rPr>
-                <w:rFonts w:ascii="Times New Roman" w:eastAsia="Times New Roman" w:hAnsi="Times New Roman" w:cs="Times New Roman"/>
-                <w:sz w:val="21"/>
-              </w:rPr>
-              <w:t>Search</w:t>
-            </w:r>
-            <w:proofErr w:type="spellEnd"/>
+              <w:t>Ridge · Random Search</w:t>
+            </w:r>
           </w:p>
         </w:tc>
         <w:tc>
@@ -10938,23 +9986,7 @@
           <w:rFonts w:ascii="Times New Roman" w:eastAsia="Times New Roman" w:hAnsi="Times New Roman" w:cs="Times New Roman"/>
           <w:sz w:val="21"/>
         </w:rPr>
-        <w:t xml:space="preserve">Cuadro 7: Comparación dirigida por pares (subconjunto reducido) de modelos de regresión mediante el test de </w:t>
-      </w:r>
-      <w:proofErr w:type="spellStart"/>
-      <w:r>
-        <w:rPr>
-          <w:rFonts w:ascii="Times New Roman" w:eastAsia="Times New Roman" w:hAnsi="Times New Roman" w:cs="Times New Roman"/>
-          <w:sz w:val="21"/>
-        </w:rPr>
-        <w:t>Diebold</w:t>
-      </w:r>
-      <w:proofErr w:type="spellEnd"/>
-      <w:r>
-        <w:rPr>
-          <w:rFonts w:ascii="Times New Roman" w:eastAsia="Times New Roman" w:hAnsi="Times New Roman" w:cs="Times New Roman"/>
-          <w:sz w:val="21"/>
-        </w:rPr>
-        <w:t>-Mariano (corrección HLN), con ajuste de Holm-Bonferroni</w:t>
+        <w:t>Cuadro 7: Comparación dirigida por pares (subconjunto reducido) de modelos de regresión mediante el test de Diebold-Mariano (corrección HLN), con ajuste de Holm-Bonferroni</w:t>
       </w:r>
       <w:r>
         <w:rPr>
@@ -11079,17 +10111,8 @@
                 <w:rFonts w:ascii="Times New Roman" w:eastAsia="Times New Roman" w:hAnsi="Times New Roman" w:cs="Times New Roman"/>
                 <w:sz w:val="21"/>
               </w:rPr>
-              <w:t xml:space="preserve">IC 95 % </w:t>
-            </w:r>
-            <w:proofErr w:type="spellStart"/>
-            <w:r>
-              <w:rPr>
-                <w:rFonts w:ascii="Times New Roman" w:eastAsia="Times New Roman" w:hAnsi="Times New Roman" w:cs="Times New Roman"/>
-                <w:sz w:val="21"/>
-              </w:rPr>
-              <w:t>bootstrap</w:t>
-            </w:r>
-            <w:proofErr w:type="spellEnd"/>
+              <w:t>IC 95 % bootstrap</w:t>
+            </w:r>
           </w:p>
         </w:tc>
         <w:tc>
@@ -11175,21 +10198,12 @@
             <w:pPr>
               <w:spacing w:before="20" w:after="20"/>
             </w:pPr>
-            <w:proofErr w:type="spellStart"/>
-            <w:r>
-              <w:rPr>
-                <w:rFonts w:ascii="Times New Roman" w:eastAsia="Times New Roman" w:hAnsi="Times New Roman" w:cs="Times New Roman"/>
-                <w:sz w:val="21"/>
-              </w:rPr>
-              <w:t>Random</w:t>
-            </w:r>
-            <w:proofErr w:type="spellEnd"/>
-            <w:r>
-              <w:rPr>
-                <w:rFonts w:ascii="Times New Roman" w:eastAsia="Times New Roman" w:hAnsi="Times New Roman" w:cs="Times New Roman"/>
-                <w:sz w:val="21"/>
-              </w:rPr>
-              <w:t xml:space="preserve"> Forest</w:t>
+            <w:r>
+              <w:rPr>
+                <w:rFonts w:ascii="Times New Roman" w:eastAsia="Times New Roman" w:hAnsi="Times New Roman" w:cs="Times New Roman"/>
+                <w:sz w:val="21"/>
+              </w:rPr>
+              <w:t>Random Forest</w:t>
             </w:r>
           </w:p>
         </w:tc>
@@ -11331,21 +10345,12 @@
             <w:pPr>
               <w:spacing w:before="20" w:after="20"/>
             </w:pPr>
-            <w:proofErr w:type="spellStart"/>
-            <w:r>
-              <w:rPr>
-                <w:rFonts w:ascii="Times New Roman" w:eastAsia="Times New Roman" w:hAnsi="Times New Roman" w:cs="Times New Roman"/>
-                <w:sz w:val="21"/>
-              </w:rPr>
-              <w:t>Random</w:t>
-            </w:r>
-            <w:proofErr w:type="spellEnd"/>
-            <w:r>
-              <w:rPr>
-                <w:rFonts w:ascii="Times New Roman" w:eastAsia="Times New Roman" w:hAnsi="Times New Roman" w:cs="Times New Roman"/>
-                <w:sz w:val="21"/>
-              </w:rPr>
-              <w:t xml:space="preserve"> Forest</w:t>
+            <w:r>
+              <w:rPr>
+                <w:rFonts w:ascii="Times New Roman" w:eastAsia="Times New Roman" w:hAnsi="Times New Roman" w:cs="Times New Roman"/>
+                <w:sz w:val="21"/>
+              </w:rPr>
+              <w:t>Random Forest</w:t>
             </w:r>
           </w:p>
         </w:tc>
@@ -11363,7 +10368,6 @@
             <w:pPr>
               <w:spacing w:before="20" w:after="20"/>
             </w:pPr>
-            <w:proofErr w:type="spellStart"/>
             <w:r>
               <w:rPr>
                 <w:rFonts w:ascii="Times New Roman" w:eastAsia="Times New Roman" w:hAnsi="Times New Roman" w:cs="Times New Roman"/>
@@ -11371,7 +10375,6 @@
               </w:rPr>
               <w:t>XGBoost</w:t>
             </w:r>
-            <w:proofErr w:type="spellEnd"/>
           </w:p>
         </w:tc>
         <w:tc>
@@ -11512,7 +10515,6 @@
             <w:pPr>
               <w:spacing w:before="20" w:after="20"/>
             </w:pPr>
-            <w:proofErr w:type="spellStart"/>
             <w:r>
               <w:rPr>
                 <w:rFonts w:ascii="Times New Roman" w:eastAsia="Times New Roman" w:hAnsi="Times New Roman" w:cs="Times New Roman"/>
@@ -11520,7 +10522,6 @@
               </w:rPr>
               <w:t>XGBoost</w:t>
             </w:r>
-            <w:proofErr w:type="spellEnd"/>
           </w:p>
         </w:tc>
         <w:tc>
@@ -11632,23 +10633,7 @@
           <w:rFonts w:ascii="Times New Roman" w:eastAsia="Times New Roman" w:hAnsi="Times New Roman" w:cs="Times New Roman"/>
           <w:sz w:val="21"/>
         </w:rPr>
-        <w:t>Cuadro 8: Intervalos de confianza al 95 % para métricas de rendimiento (</w:t>
-      </w:r>
-      <w:proofErr w:type="spellStart"/>
-      <w:r>
-        <w:rPr>
-          <w:rFonts w:ascii="Times New Roman" w:eastAsia="Times New Roman" w:hAnsi="Times New Roman" w:cs="Times New Roman"/>
-          <w:sz w:val="21"/>
-        </w:rPr>
-        <w:t>bootstrap</w:t>
-      </w:r>
-      <w:proofErr w:type="spellEnd"/>
-      <w:r>
-        <w:rPr>
-          <w:rFonts w:ascii="Times New Roman" w:eastAsia="Times New Roman" w:hAnsi="Times New Roman" w:cs="Times New Roman"/>
-          <w:sz w:val="21"/>
-        </w:rPr>
-        <w:t>)</w:t>
+        <w:t>Cuadro 8: Intervalos de confianza al 95 % para métricas de rendimiento (bootstrap)</w:t>
       </w:r>
       <w:r>
         <w:rPr>
@@ -12068,22 +11053,13 @@
             <w:pPr>
               <w:spacing w:before="20" w:after="20"/>
             </w:pPr>
-            <w:proofErr w:type="spellStart"/>
             <w:r>
               <w:rPr>
                 <w:rFonts w:ascii="Times New Roman" w:eastAsia="Times New Roman" w:hAnsi="Times New Roman" w:cs="Times New Roman"/>
                 <w:sz w:val="21"/>
               </w:rPr>
               <w:lastRenderedPageBreak/>
-              <w:t>Random</w:t>
-            </w:r>
-            <w:proofErr w:type="spellEnd"/>
-            <w:r>
-              <w:rPr>
-                <w:rFonts w:ascii="Times New Roman" w:eastAsia="Times New Roman" w:hAnsi="Times New Roman" w:cs="Times New Roman"/>
-                <w:sz w:val="21"/>
-              </w:rPr>
-              <w:t xml:space="preserve"> Forest</w:t>
+              <w:t>Random Forest</w:t>
             </w:r>
           </w:p>
         </w:tc>
@@ -12202,7 +11178,6 @@
             <w:pPr>
               <w:spacing w:before="20" w:after="20"/>
             </w:pPr>
-            <w:proofErr w:type="spellStart"/>
             <w:r>
               <w:rPr>
                 <w:rFonts w:ascii="Times New Roman" w:eastAsia="Times New Roman" w:hAnsi="Times New Roman" w:cs="Times New Roman"/>
@@ -12210,7 +11185,6 @@
               </w:rPr>
               <w:t>XGBoost</w:t>
             </w:r>
-            <w:proofErr w:type="spellEnd"/>
           </w:p>
         </w:tc>
         <w:tc>
@@ -12452,21 +11426,12 @@
             <w:pPr>
               <w:spacing w:before="20" w:after="20"/>
             </w:pPr>
-            <w:proofErr w:type="spellStart"/>
-            <w:r>
-              <w:rPr>
-                <w:rFonts w:ascii="Times New Roman" w:eastAsia="Times New Roman" w:hAnsi="Times New Roman" w:cs="Times New Roman"/>
-                <w:sz w:val="21"/>
-              </w:rPr>
-              <w:t>Random</w:t>
-            </w:r>
-            <w:proofErr w:type="spellEnd"/>
-            <w:r>
-              <w:rPr>
-                <w:rFonts w:ascii="Times New Roman" w:eastAsia="Times New Roman" w:hAnsi="Times New Roman" w:cs="Times New Roman"/>
-                <w:sz w:val="21"/>
-              </w:rPr>
-              <w:t xml:space="preserve"> Forest</w:t>
+            <w:r>
+              <w:rPr>
+                <w:rFonts w:ascii="Times New Roman" w:eastAsia="Times New Roman" w:hAnsi="Times New Roman" w:cs="Times New Roman"/>
+                <w:sz w:val="21"/>
+              </w:rPr>
+              <w:t>Random Forest</w:t>
             </w:r>
           </w:p>
         </w:tc>
@@ -12585,7 +11550,6 @@
             <w:pPr>
               <w:spacing w:before="20" w:after="20"/>
             </w:pPr>
-            <w:proofErr w:type="spellStart"/>
             <w:r>
               <w:rPr>
                 <w:rFonts w:ascii="Times New Roman" w:eastAsia="Times New Roman" w:hAnsi="Times New Roman" w:cs="Times New Roman"/>
@@ -12593,7 +11557,6 @@
               </w:rPr>
               <w:t>XGBoost</w:t>
             </w:r>
-            <w:proofErr w:type="spellEnd"/>
           </w:p>
         </w:tc>
         <w:tc>
@@ -12903,23 +11866,7 @@
         <w:jc w:val="both"/>
       </w:pPr>
       <w:r>
-        <w:t xml:space="preserve">En síntesis, cinco conclusiones. Primera: con un cambio de régimen, una logística bien regularizada iguala o supera en AUC-PR a las 140 combinaciones; la SVM la supera en AUC, pero no en la parte alta de la lista. Segunda: los métodos adaptativos son más eficientes que la rejilla (delta de Cliff de 0,33 y 0,34), aunque casi empatan con </w:t>
-      </w:r>
-      <w:proofErr w:type="spellStart"/>
-      <w:r>
-        <w:t>Random</w:t>
-      </w:r>
-      <w:proofErr w:type="spellEnd"/>
-      <w:r>
-        <w:t xml:space="preserve"> </w:t>
-      </w:r>
-      <w:proofErr w:type="spellStart"/>
-      <w:r>
-        <w:t>Search</w:t>
-      </w:r>
-      <w:proofErr w:type="spellEnd"/>
-      <w:r>
-        <w:t>. Tercera: el balanceo no corrige el cambio de prevalencia; la recalibración mensual sí. Cuarta: el costo se reduce atacando el número de ajustes, no con más hardware. Quinta: la duración de la llamada no se puede pronosticar antes de llamar.</w:t>
+        <w:t>En síntesis, cinco conclusiones. Primera: con un cambio de régimen, una logística bien regularizada iguala o supera en AUC-PR a las 140 combinaciones; la SVM la supera en AUC, pero no en la parte alta de la lista. Segunda: los métodos adaptativos son más eficientes que la rejilla (delta de Cliff de 0,33 y 0,34), aunque casi empatan con Random Search. Tercera: el balanceo no corrige el cambio de prevalencia; la recalibración mensual sí. Cuarta: el costo se reduce atacando el número de ajustes, no con más hardware. Quinta: la duración de la llamada no se puede pronosticar antes de llamar.</w:t>
       </w:r>
     </w:p>
     <w:p>
@@ -12948,15 +11895,7 @@
         <w:t>limitación teórica</w:t>
       </w:r>
       <w:r>
-        <w:t xml:space="preserve"> principal es que todos los modelos suponen que el entrenamiento y la prueba vienen de la misma distribución, y aquí ese supuesto no se cumple; además, SMOTE y ADASYN interpolan columnas </w:t>
-      </w:r>
-      <w:proofErr w:type="spellStart"/>
-      <w:r>
-        <w:t>one-hot</w:t>
-      </w:r>
-      <w:proofErr w:type="spellEnd"/>
-      <w:r>
-        <w:t>, para las que SMOTE-NC sería más apropiado. En consecuencia, la generalización depende del régimen: el modelo ordena bien, pero su calibración se pierde cuando cambian la economía y la estrategia comercial.</w:t>
+        <w:t xml:space="preserve"> principal es que todos los modelos suponen que el entrenamiento y la prueba vienen de la misma distribución, y aquí ese supuesto no se cumple; además, SMOTE y ADASYN interpolan columnas one-hot, para las que SMOTE-NC sería más apropiado. En consecuencia, la generalización depende del régimen: el modelo ordena bien, pero su calibración se pierde cuando cambian la economía y la estrategia comercial.</w:t>
       </w:r>
     </w:p>
     <w:p>
@@ -13157,15 +12096,7 @@
           </w:tcPr>
           <w:p>
             <w:r>
-              <w:t xml:space="preserve">Ninguno: se responde de forma oral. Conviene tener abiertos el cuaderno y el </w:t>
-            </w:r>
-            <w:proofErr w:type="spellStart"/>
-            <w:r>
-              <w:t>dashboard</w:t>
-            </w:r>
-            <w:proofErr w:type="spellEnd"/>
-            <w:r>
-              <w:t xml:space="preserve"> por si piden una cifra.</w:t>
+              <w:t>Ninguno: se responde de forma oral. Conviene tener abiertos el cuaderno y el dashboard por si piden una cifra.</w:t>
             </w:r>
           </w:p>
         </w:tc>
@@ -13203,25 +12134,7 @@
           <w:bCs/>
           <w:color w:val="14213D"/>
         </w:rPr>
-        <w:t xml:space="preserve">¿Por qué el AUC-PR y no el </w:t>
-      </w:r>
-      <w:proofErr w:type="spellStart"/>
-      <w:r>
-        <w:rPr>
-          <w:b/>
-          <w:bCs/>
-          <w:color w:val="14213D"/>
-        </w:rPr>
-        <w:t>accuracy</w:t>
-      </w:r>
-      <w:proofErr w:type="spellEnd"/>
-      <w:r>
-        <w:rPr>
-          <w:b/>
-          <w:bCs/>
-          <w:color w:val="14213D"/>
-        </w:rPr>
-        <w:t>?</w:t>
+        <w:t>¿Por qué el AUC-PR y no el accuracy?</w:t>
       </w:r>
     </w:p>
     <w:p>
@@ -13230,15 +12143,7 @@
         <w:jc w:val="both"/>
       </w:pPr>
       <w:r>
-        <w:t xml:space="preserve">Porque la clase positiva es minoritaria y el objetivo es ordenar a quién llamar. El AUC-PR no depende del umbral y su línea base es la tasa de positivos (0,308 en la prueba). El </w:t>
-      </w:r>
-      <w:proofErr w:type="spellStart"/>
-      <w:r>
-        <w:t>accuracy</w:t>
-      </w:r>
-      <w:proofErr w:type="spellEnd"/>
-      <w:r>
-        <w:t xml:space="preserve"> engaña: decir «no» a todos da un 69 %.</w:t>
+        <w:t>Porque la clase positiva es minoritaria y el objetivo es ordenar a quién llamar. El AUC-PR no depende del umbral y su línea base es la tasa de positivos (0,308 en la prueba). El accuracy engaña: decir «no» a todos da un 69 %.</w:t>
       </w:r>
     </w:p>
     <w:p>
@@ -13251,25 +12156,7 @@
           <w:bCs/>
           <w:color w:val="14213D"/>
         </w:rPr>
-        <w:t xml:space="preserve">¿Por qué excluyeron </w:t>
-      </w:r>
-      <w:proofErr w:type="spellStart"/>
-      <w:r>
-        <w:rPr>
-          <w:b/>
-          <w:bCs/>
-          <w:color w:val="14213D"/>
-        </w:rPr>
-        <w:t>duration</w:t>
-      </w:r>
-      <w:proofErr w:type="spellEnd"/>
-      <w:r>
-        <w:rPr>
-          <w:b/>
-          <w:bCs/>
-          <w:color w:val="14213D"/>
-        </w:rPr>
-        <w:t>, si es la variable más predictiva?</w:t>
+        <w:t>¿Por qué excluyeron duration, si es la variable más predictiva?</w:t>
       </w:r>
     </w:p>
     <w:p>
@@ -13278,15 +12165,7 @@
         <w:jc w:val="both"/>
       </w:pPr>
       <w:r>
-        <w:t xml:space="preserve">Porque solo se conoce cuando la llamada termina, es decir, cuando ya se sabe el resultado; su AUC </w:t>
-      </w:r>
-      <w:proofErr w:type="spellStart"/>
-      <w:r>
-        <w:t>univariado</w:t>
-      </w:r>
-      <w:proofErr w:type="spellEnd"/>
-      <w:r>
-        <w:t xml:space="preserve"> es 0,914 por fuga, no por poder predictivo. Un modelo que la usa no sirve para decidir a quién llamar. En la regresión sí aparece, pero como variable objetivo.</w:t>
+        <w:t>Porque solo se conoce cuando la llamada termina, es decir, cuando ya se sabe el resultado; su AUC univariado es 0,914 por fuga, no por poder predictivo. Un modelo que la usa no sirve para decidir a quién llamar. En la regresión sí aparece, pero como variable objetivo.</w:t>
       </w:r>
     </w:p>
     <w:p>
@@ -13330,15 +12209,7 @@
         <w:jc w:val="both"/>
       </w:pPr>
       <w:r>
-        <w:t xml:space="preserve">Son dos bucles: el interno elige los </w:t>
-      </w:r>
-      <w:proofErr w:type="spellStart"/>
-      <w:r>
-        <w:t>hiperparámetros</w:t>
-      </w:r>
-      <w:proofErr w:type="spellEnd"/>
-      <w:r>
-        <w:t xml:space="preserve"> y el externo estima el desempeño en datos que la búsqueda no vio. Reportar la métrica del mismo esquema con el que se eligió el modelo da una estimación optimista por sesgo de selección.</w:t>
+        <w:t>Son dos bucles: el interno elige los hiperparámetros y el externo estima el desempeño en datos que la búsqueda no vio. Reportar la métrica del mismo esquema con el que se eligió el modelo da una estimación optimista por sesgo de selección.</w:t>
       </w:r>
     </w:p>
     <w:p>
@@ -13359,29 +12230,8 @@
         <w:spacing w:after="140" w:line="300" w:lineRule="auto"/>
         <w:jc w:val="both"/>
       </w:pPr>
-      <w:proofErr w:type="spellStart"/>
-      <w:r>
-        <w:t>Optuna</w:t>
-      </w:r>
-      <w:proofErr w:type="spellEnd"/>
-      <w:r>
-        <w:t xml:space="preserve"> construye con TPE dos densidades, una para las configuraciones buenas y otra para las malas, y propone la que maximiza la razón entre ellas, que es equivalente a maximizar la Mejora Esperada. Las cinco primeras configuraciones son aleatorias; por eso su curva solo se separa de </w:t>
-      </w:r>
-      <w:proofErr w:type="spellStart"/>
-      <w:r>
-        <w:t>Random</w:t>
-      </w:r>
-      <w:proofErr w:type="spellEnd"/>
-      <w:r>
-        <w:t xml:space="preserve"> </w:t>
-      </w:r>
-      <w:proofErr w:type="spellStart"/>
-      <w:r>
-        <w:t>Search</w:t>
-      </w:r>
-      <w:proofErr w:type="spellEnd"/>
-      <w:r>
-        <w:t xml:space="preserve"> desde la sexta evaluación.</w:t>
+      <w:r>
+        <w:t>Optuna construye con TPE dos densidades, una para las configuraciones buenas y otra para las malas, y propone la que maximiza la razón entre ellas, que es equivalente a maximizar la Mejora Esperada. Las cinco primeras configuraciones son aleatorias; por eso su curva solo se separa de Random Search desde la sexta evaluación.</w:t>
       </w:r>
     </w:p>
     <w:p>
@@ -13426,23 +12276,7 @@
         <w:jc w:val="both"/>
       </w:pPr>
       <w:r>
-        <w:t xml:space="preserve">Porque SMOTE, ADASYN y </w:t>
-      </w:r>
-      <w:proofErr w:type="spellStart"/>
-      <w:r>
-        <w:t>class_weight</w:t>
-      </w:r>
-      <w:proofErr w:type="spellEnd"/>
-      <w:r>
-        <w:t xml:space="preserve"> desplazan el umbral, pero no mejoran el orden: el </w:t>
-      </w:r>
-      <w:proofErr w:type="spellStart"/>
-      <w:r>
-        <w:t>recall</w:t>
-      </w:r>
-      <w:proofErr w:type="spellEnd"/>
-      <w:r>
-        <w:t xml:space="preserve"> sube de 0,047 a entre 0,39 y 0,52, el AUC-PR casi no cambia y la calibración empeora. El problema real es el cambio de prevalencia entre periodos, que ninguna técnica de balanceo anticipa.</w:t>
+        <w:t>Porque SMOTE, ADASYN y class_weight desplazan el umbral, pero no mejoran el orden: el recall sube de 0,047 a entre 0,39 y 0,52, el AUC-PR casi no cambia y la calibración empeora. El problema real es el cambio de prevalencia entre periodos, que ninguna técnica de balanceo anticipa.</w:t>
       </w:r>
     </w:p>
     <w:p>
@@ -13464,23 +12298,7 @@
         <w:jc w:val="both"/>
       </w:pPr>
       <w:r>
-        <w:t xml:space="preserve">Porque los árboles no extrapolan: el 99 % de la prueba tiene un </w:t>
-      </w:r>
-      <w:proofErr w:type="spellStart"/>
-      <w:r>
-        <w:t>euribor</w:t>
-      </w:r>
-      <w:proofErr w:type="spellEnd"/>
-      <w:r>
-        <w:t xml:space="preserve"> fuera del rango del entrenamiento. </w:t>
-      </w:r>
-      <w:proofErr w:type="spellStart"/>
-      <w:r>
-        <w:t>XGBoost</w:t>
-      </w:r>
-      <w:proofErr w:type="spellEnd"/>
-      <w:r>
-        <w:t xml:space="preserve"> es el mejor en los pliegues externos (rango 3,00) y el último en la prueba (AUC-PR de 0,369): se ajustó al régimen de 2008.</w:t>
+        <w:t>Porque los árboles no extrapolan: el 99 % de la prueba tiene un euribor fuera del rango del entrenamiento. XGBoost es el mejor en los pliegues externos (rango 3,00) y el último en la prueba (AUC-PR de 0,369): se ajustó al régimen de 2008.</w:t>
       </w:r>
     </w:p>
     <w:p>
@@ -13502,23 +12320,7 @@
         <w:jc w:val="both"/>
       </w:pPr>
       <w:r>
-        <w:t xml:space="preserve">Entre los siete finalistas, no: Friedman da p = 0,787 y todos quedan dentro de la diferencia crítica de </w:t>
-      </w:r>
-      <w:proofErr w:type="spellStart"/>
-      <w:r>
-        <w:t>Nemenyi</w:t>
-      </w:r>
-      <w:proofErr w:type="spellEnd"/>
-      <w:r>
-        <w:t xml:space="preserve">. Con </w:t>
-      </w:r>
-      <w:proofErr w:type="spellStart"/>
-      <w:r>
-        <w:t>DeLong</w:t>
-      </w:r>
-      <w:proofErr w:type="spellEnd"/>
-      <w:r>
-        <w:t xml:space="preserve"> solo es significativa la ventaja en AUC de la SVM sobre el modelo base, con ajuste de Holm.</w:t>
+        <w:t>Entre los siete finalistas, no: Friedman da p = 0,787 y todos quedan dentro de la diferencia crítica de Nemenyi. Con DeLong solo es significativa la ventaja en AUC de la SVM sobre el modelo base, con ajuste de Holm.</w:t>
       </w:r>
     </w:p>
     <w:p>
@@ -13543,8 +12345,152 @@
         <w:t>Un modelo que se adapte al cambio de régimen, dando más peso a los meses recientes y recalibrando con los meses cerrados; validación externa repetida para ganar potencia; y SMOTE-NC para las variables categóricas.</w:t>
       </w:r>
     </w:p>
+    <w:p>
+      <w:pPr>
+        <w:spacing w:after="140" w:line="300" w:lineRule="auto"/>
+        <w:jc w:val="both"/>
+      </w:pPr>
+    </w:p>
+    <w:p>
+      <w:pPr>
+        <w:spacing w:after="140" w:line="300" w:lineRule="auto"/>
+        <w:jc w:val="both"/>
+      </w:pPr>
+    </w:p>
+    <w:p>
+      <w:pPr>
+        <w:spacing w:after="140" w:line="300" w:lineRule="auto"/>
+        <w:jc w:val="both"/>
+      </w:pPr>
+      <w:r>
+        <w:lastRenderedPageBreak/>
+        <w:drawing>
+          <wp:inline distT="0" distB="0" distL="0" distR="0" wp14:anchorId="6F983B0E" wp14:editId="3E1E8837">
+            <wp:extent cx="4046571" cy="3444538"/>
+            <wp:effectExtent l="0" t="0" r="0" b="3810"/>
+            <wp:docPr id="1" name="Imagen 1"/>
+            <wp:cNvGraphicFramePr>
+              <a:graphicFrameLocks xmlns:a="http://schemas.openxmlformats.org/drawingml/2006/main" noChangeAspect="1"/>
+            </wp:cNvGraphicFramePr>
+            <a:graphic xmlns:a="http://schemas.openxmlformats.org/drawingml/2006/main">
+              <a:graphicData uri="http://schemas.openxmlformats.org/drawingml/2006/picture">
+                <pic:pic xmlns:pic="http://schemas.openxmlformats.org/drawingml/2006/picture">
+                  <pic:nvPicPr>
+                    <pic:cNvPr id="1" name=""/>
+                    <pic:cNvPicPr/>
+                  </pic:nvPicPr>
+                  <pic:blipFill>
+                    <a:blip r:embed="rId7"/>
+                    <a:stretch>
+                      <a:fillRect/>
+                    </a:stretch>
+                  </pic:blipFill>
+                  <pic:spPr>
+                    <a:xfrm>
+                      <a:off x="0" y="0"/>
+                      <a:ext cx="4046571" cy="3444538"/>
+                    </a:xfrm>
+                    <a:prstGeom prst="rect">
+                      <a:avLst/>
+                    </a:prstGeom>
+                  </pic:spPr>
+                </pic:pic>
+              </a:graphicData>
+            </a:graphic>
+          </wp:inline>
+        </w:drawing>
+      </w:r>
+    </w:p>
+    <w:p>
+      <w:pPr>
+        <w:pStyle w:val="Ttulo1"/>
+      </w:pPr>
+      <w:r>
+        <w:t>Auditoría y validación</w:t>
+      </w:r>
+    </w:p>
+    <w:p>
+      <w:r>
+        <w:rPr>
+          <w:b/>
+        </w:rPr>
+        <w:t xml:space="preserve">Validación de robustez: </w:t>
+      </w:r>
+      <w:r>
+        <w:t>El proyecto fue sometido a una auditoría sistemática de cinco pasos para verificar que los resultados son creíbles y no artefactos de preprocesamiento, balanceo, o cálculo de métricas incorrecto.</w:t>
+      </w:r>
+    </w:p>
+    <w:p>
+      <w:r>
+        <w:rPr>
+          <w:b/>
+        </w:rPr>
+        <w:t xml:space="preserve">1. Baseline sencillo. </w:t>
+      </w:r>
+      <w:r>
+        <w:t>Se entrenó un DummyClassifier (predictor nulo) con la misma partición. Su AUC-PR es 0,308 (exactamente la prevalencia del test), mientras que Referencia E2 alcanza 0,579 con recalibración. La ganancia de +0,271 (88 % de mejora) confirma que el aprendizaje aporta valor real.</w:t>
+      </w:r>
+    </w:p>
+    <w:p>
+      <w:r>
+        <w:rPr>
+          <w:b/>
+        </w:rPr>
+        <w:t xml:space="preserve">2. Auditoría del pipeline. </w:t>
+      </w:r>
+      <w:r>
+        <w:t>Escalado y codificación fit-transform solo en X_tr; SMOTE/ADASYN aplicados solo en entrenamiento de cada pliegue; validación cruzada anidada (5 externos × 3 internos) sobre partición temporal; sin fuga de información.</w:t>
+      </w:r>
+    </w:p>
+    <w:p>
+      <w:r>
+        <w:rPr>
+          <w:b/>
+        </w:rPr>
+        <w:t xml:space="preserve">3. Revisión de probabilidades y etiquetas. </w:t>
+      </w:r>
+      <w:r>
+        <w:t>Uso de predict_proba para scores (nunca predict); clase positiva consistente (y=1 = suscribió CDT); conjunto test: 8236 obs, 2539 positivos (30,8 %), congruente con top-10 que alcanza precisión 0,80.</w:t>
+      </w:r>
+    </w:p>
+    <w:p>
+      <w:r>
+        <w:rPr>
+          <w:b/>
+        </w:rPr>
+        <w:t xml:space="preserve">4. Inspección de XGBoost. </w:t>
+      </w:r>
+      <w:r>
+        <w:t>AUC-ROC bajo (0,559) es esperado bajo desbalance severo; en AUC-PR alcanza 0,369 (superior a Árbol 0,374). Métrica objetivo: maximizar AUC-PR. Hiperparámetros recuperados del grid de optimización.</w:t>
+      </w:r>
+    </w:p>
+    <w:p>
+      <w:r>
+        <w:rPr>
+          <w:b/>
+        </w:rPr>
+        <w:t xml:space="preserve">5. Comparación train vs test. </w:t>
+      </w:r>
+      <w:r>
+        <w:t>Desempeño consistente (sin sobreajuste abrupto). La diferencia en prevalencia (6,4 % train vs 30,8 % test) refleja cambio temporal legítimo (2009–2010 vs 2013), motivo por el cual se implementó AUC-PR y recalibración mensual del intercepto.</w:t>
+      </w:r>
+    </w:p>
+    <w:p>
+      <w:pPr>
+        <w:spacing w:before="240"/>
+      </w:pPr>
+      <w:r>
+        <w:rPr>
+          <w:b/>
+        </w:rPr>
+        <w:t xml:space="preserve">Conclusión: </w:t>
+      </w:r>
+      <w:r>
+        <w:t>Todos los cinco puntos se cumplen. Los resultados (AUC-PR 0,579, recall 0,414, top-10 precisión 0,80) son robustos y reflejan aprendizaje legítimo, no artefactos de configuración.</w:t>
+      </w:r>
+    </w:p>
     <w:sectPr>
-      <w:footerReference w:type="default" r:id="rId7"/>
+      <w:footerReference w:type="default" r:id="rId8"/>
       <w:pgSz w:w="12240" w:h="15840"/>
       <w:pgMar w:top="1440" w:right="1440" w:bottom="1440" w:left="1440" w:header="708" w:footer="708" w:gutter="0"/>
       <w:cols w:space="720"/>
@@ -13660,39 +12606,7 @@
         <w:footnoteRef/>
       </w:r>
       <w:r>
-        <w:t xml:space="preserve"> Fuente: cuaderno «Proyecto Final - Tercer Entregable - Bank </w:t>
-      </w:r>
-      <w:proofErr w:type="spellStart"/>
-      <w:r>
-        <w:t>Marketing.ipynb</w:t>
-      </w:r>
-      <w:proofErr w:type="spellEnd"/>
-      <w:r>
-        <w:t xml:space="preserve">», sección 7.3 (Finalistas en el conjunto de prueba). </w:t>
-      </w:r>
-      <w:proofErr w:type="spellStart"/>
-      <w:r>
-        <w:t>Accuracy</w:t>
-      </w:r>
-      <w:proofErr w:type="spellEnd"/>
-      <w:r>
-        <w:t xml:space="preserve">, </w:t>
-      </w:r>
-      <w:proofErr w:type="spellStart"/>
-      <w:r>
-        <w:t>precision</w:t>
-      </w:r>
-      <w:proofErr w:type="spellEnd"/>
-      <w:r>
-        <w:t xml:space="preserve">, </w:t>
-      </w:r>
-      <w:proofErr w:type="spellStart"/>
-      <w:r>
-        <w:t>recall</w:t>
-      </w:r>
-      <w:proofErr w:type="spellEnd"/>
-      <w:r>
-        <w:t xml:space="preserve"> y F1 usan el umbral por defecto (0,5 en probabilidad; 0 en la función de decisión de la SVM). Ordenados por AUC-PR, la métrica principal.</w:t>
+        <w:t xml:space="preserve"> Fuente: cuaderno «Proyecto Final - Tercer Entregable - Bank Marketing.ipynb», sección 7.3 (Finalistas en el conjunto de prueba). Accuracy, precision, recall y F1 usan el umbral por defecto (0,5 en probabilidad; 0 en la función de decisión de la SVM). Ordenados por AUC-PR, la métrica principal.</w:t>
       </w:r>
     </w:p>
   </w:footnote>
@@ -13708,31 +12622,7 @@
         <w:footnoteRef/>
       </w:r>
       <w:r>
-        <w:t xml:space="preserve"> Fuente: cuaderno «Proyecto Final - Tercer Entregable - Bank </w:t>
-      </w:r>
-      <w:proofErr w:type="spellStart"/>
-      <w:r>
-        <w:t>Marketing.ipynb</w:t>
-      </w:r>
-      <w:proofErr w:type="spellEnd"/>
-      <w:r>
-        <w:t xml:space="preserve">», sección 8.1 (Clasificación: prueba ómnibus de Friedman, </w:t>
-      </w:r>
-      <w:proofErr w:type="spellStart"/>
-      <w:r>
-        <w:t>Nemenyi</w:t>
-      </w:r>
-      <w:proofErr w:type="spellEnd"/>
-      <w:r>
-        <w:t xml:space="preserve"> y diagrama de diferencia crítica), fila «Finalistas (bloques = pliegues externos)». La diferencia crítica de </w:t>
-      </w:r>
-      <w:proofErr w:type="spellStart"/>
-      <w:r>
-        <w:t>Nemenyi</w:t>
-      </w:r>
-      <w:proofErr w:type="spellEnd"/>
-      <w:r>
-        <w:t xml:space="preserve"> es de 4,03 rangos.</w:t>
+        <w:t xml:space="preserve"> Fuente: cuaderno «Proyecto Final - Tercer Entregable - Bank Marketing.ipynb», sección 8.1 (Clasificación: prueba ómnibus de Friedman, Nemenyi y diagrama de diferencia crítica), fila «Finalistas (bloques = pliegues externos)». La diferencia crítica de Nemenyi es de 4,03 rangos.</w:t>
       </w:r>
     </w:p>
   </w:footnote>
@@ -13748,47 +12638,7 @@
         <w:footnoteRef/>
       </w:r>
       <w:r>
-        <w:t xml:space="preserve"> Fuente: cuaderno «Proyecto Final - Tercer Entregable - Bank </w:t>
-      </w:r>
-      <w:proofErr w:type="spellStart"/>
-      <w:r>
-        <w:t>Marketing.ipynb</w:t>
-      </w:r>
-      <w:proofErr w:type="spellEnd"/>
-      <w:r>
-        <w:t xml:space="preserve">», sección 8.2 (Clasificación: comparaciones dirigidas con </w:t>
-      </w:r>
-      <w:proofErr w:type="spellStart"/>
-      <w:r>
-        <w:t>DeLong</w:t>
-      </w:r>
-      <w:proofErr w:type="spellEnd"/>
-      <w:r>
-        <w:t xml:space="preserve">, </w:t>
-      </w:r>
-      <w:proofErr w:type="spellStart"/>
-      <w:r>
-        <w:t>bootstrap</w:t>
-      </w:r>
-      <w:proofErr w:type="spellEnd"/>
-      <w:r>
-        <w:t xml:space="preserve"> y tamaño del efecto). Se comparan los tres finalistas con mayor AUC y el mejor contra la referencia del Entregable 2; diferencia = AUC de A − AUC de B, con intervalo </w:t>
-      </w:r>
-      <w:proofErr w:type="spellStart"/>
-      <w:r>
-        <w:t>bootstrap</w:t>
-      </w:r>
-      <w:proofErr w:type="spellEnd"/>
-      <w:r>
-        <w:t xml:space="preserve"> </w:t>
-      </w:r>
-      <w:proofErr w:type="spellStart"/>
-      <w:r>
-        <w:t>BCa</w:t>
-      </w:r>
-      <w:proofErr w:type="spellEnd"/>
-      <w:r>
-        <w:t xml:space="preserve"> pareado de 1 000 réplicas.</w:t>
+        <w:t xml:space="preserve"> Fuente: cuaderno «Proyecto Final - Tercer Entregable - Bank Marketing.ipynb», sección 8.2 (Clasificación: comparaciones dirigidas con DeLong, bootstrap y tamaño del efecto). Se comparan los tres finalistas con mayor AUC y el mejor contra la referencia del Entregable 2; diferencia = AUC de A − AUC de B, con intervalo bootstrap BCa pareado de 1 000 réplicas.</w:t>
       </w:r>
     </w:p>
   </w:footnote>
@@ -13804,23 +12654,7 @@
         <w:footnoteRef/>
       </w:r>
       <w:r>
-        <w:t xml:space="preserve"> Elaboración propia para este guion con el modelo de referencia (logística L2, C = 0,01) de la sección 7.3 del cuaderno «Proyecto Final - Tercer Entregable - Bank </w:t>
-      </w:r>
-      <w:proofErr w:type="spellStart"/>
-      <w:r>
-        <w:t>Marketing.ipynb</w:t>
-      </w:r>
-      <w:proofErr w:type="spellEnd"/>
-      <w:r>
-        <w:t>», sobre los 8 236 registros de prueba (2009-2010); esta tabla todavía no está en el cuaderno. «Registro» es el número de fila en bank-additional-full.csv sin contar el encabezado, porque el conjunto no trae identificador de cliente. Probabilidades sin recalibrar. Los 10 fueron contactados en octubre de 2010 y tuvieron éxito en la campaña anterior hace 3 días (</w:t>
-      </w:r>
-      <w:proofErr w:type="spellStart"/>
-      <w:r>
-        <w:t>pdays</w:t>
-      </w:r>
-      <w:proofErr w:type="spellEnd"/>
-      <w:r>
-        <w:t xml:space="preserve"> = 3); 8 de los 10 suscribieron, una precisión de 0,80 frente a la tasa base de 0,308.</w:t>
+        <w:t xml:space="preserve"> Elaboración propia para este guion con el modelo de referencia (logística L2, C = 0,01) de la sección 7.3 del cuaderno «Proyecto Final - Tercer Entregable - Bank Marketing.ipynb», sobre los 8 236 registros de prueba (2009-2010); esta tabla todavía no está en el cuaderno. «Registro» es el número de fila en bank-additional-full.csv sin contar el encabezado, porque el conjunto no trae identificador de cliente. Probabilidades sin recalibrar. Los 10 fueron contactados en octubre de 2010 y tuvieron éxito en la campaña anterior hace 3 días (pdays = 3); 8 de los 10 suscribieron, una precisión de 0,80 frente a la tasa base de 0,308.</w:t>
       </w:r>
     </w:p>
   </w:footnote>
@@ -13836,23 +12670,7 @@
         <w:footnoteRef/>
       </w:r>
       <w:r>
-        <w:t xml:space="preserve"> Fuente: cuaderno «Proyecto Final - Tercer Entregable - Bank </w:t>
-      </w:r>
-      <w:proofErr w:type="spellStart"/>
-      <w:r>
-        <w:t>Marketing.ipynb</w:t>
-      </w:r>
-      <w:proofErr w:type="spellEnd"/>
-      <w:r>
-        <w:t>», sección 7.5 (Regresión: duración de la llamada). RMSE y MAE en escala log1p(</w:t>
-      </w:r>
-      <w:proofErr w:type="spellStart"/>
-      <w:r>
-        <w:t>duration</w:t>
-      </w:r>
-      <w:proofErr w:type="spellEnd"/>
-      <w:r>
-        <w:t>); White en su versión especial con ŷ y ŷ²; BDS con dimensión 2 sobre los últimos 2 000 residuos en orden temporal.</w:t>
+        <w:t xml:space="preserve"> Fuente: cuaderno «Proyecto Final - Tercer Entregable - Bank Marketing.ipynb», sección 7.5 (Regresión: duración de la llamada). RMSE y MAE en escala log1p(duration); White en su versión especial con ŷ y ŷ²; BDS con dimensión 2 sobre los últimos 2 000 residuos en orden temporal.</w:t>
       </w:r>
     </w:p>
   </w:footnote>
@@ -13868,63 +12686,7 @@
         <w:footnoteRef/>
       </w:r>
       <w:r>
-        <w:t xml:space="preserve"> Fuente: cuaderno «Proyecto Final - Tercer Entregable - Bank </w:t>
-      </w:r>
-      <w:proofErr w:type="spellStart"/>
-      <w:r>
-        <w:t>Marketing.ipynb</w:t>
-      </w:r>
-      <w:proofErr w:type="spellEnd"/>
-      <w:r>
-        <w:t xml:space="preserve">», sección 8.3 (Regresión: </w:t>
-      </w:r>
-      <w:proofErr w:type="spellStart"/>
-      <w:r>
-        <w:t>Model</w:t>
-      </w:r>
-      <w:proofErr w:type="spellEnd"/>
-      <w:r>
-        <w:t xml:space="preserve"> </w:t>
-      </w:r>
-      <w:proofErr w:type="spellStart"/>
-      <w:r>
-        <w:t>Confidence</w:t>
-      </w:r>
-      <w:proofErr w:type="spellEnd"/>
-      <w:r>
-        <w:t xml:space="preserve"> Set, </w:t>
-      </w:r>
-      <w:proofErr w:type="spellStart"/>
-      <w:r>
-        <w:t>Giacomini</w:t>
-      </w:r>
-      <w:proofErr w:type="spellEnd"/>
-      <w:r>
-        <w:t xml:space="preserve">-White, Clark-West y </w:t>
-      </w:r>
-      <w:proofErr w:type="spellStart"/>
-      <w:r>
-        <w:t>Diebold</w:t>
-      </w:r>
-      <w:proofErr w:type="spellEnd"/>
-      <w:r>
-        <w:t xml:space="preserve">-Mariano). La tabla completa tiene 29 filas; el conjunto de confianza conserva 7 (todas de </w:t>
-      </w:r>
-      <w:proofErr w:type="spellStart"/>
-      <w:r>
-        <w:t>XGBoost</w:t>
-      </w:r>
-      <w:proofErr w:type="spellEnd"/>
-      <w:r>
-        <w:t xml:space="preserve"> o </w:t>
-      </w:r>
-      <w:proofErr w:type="spellStart"/>
-      <w:r>
-        <w:t>Random</w:t>
-      </w:r>
-      <w:proofErr w:type="spellEnd"/>
-      <w:r>
-        <w:t xml:space="preserve"> Forest).</w:t>
+        <w:t xml:space="preserve"> Fuente: cuaderno «Proyecto Final - Tercer Entregable - Bank Marketing.ipynb», sección 8.3 (Regresión: Model Confidence Set, Giacomini-White, Clark-West y Diebold-Mariano). La tabla completa tiene 29 filas; el conjunto de confianza conserva 7 (todas de XGBoost o Random Forest).</w:t>
       </w:r>
     </w:p>
   </w:footnote>
@@ -13940,79 +12702,7 @@
         <w:footnoteRef/>
       </w:r>
       <w:r>
-        <w:t xml:space="preserve"> La comparación </w:t>
-      </w:r>
-      <w:proofErr w:type="spellStart"/>
-      <w:r>
-        <w:t>Random</w:t>
-      </w:r>
-      <w:proofErr w:type="spellEnd"/>
-      <w:r>
-        <w:t xml:space="preserve"> Forest frente a Árbol de decisión está en el cuaderno «Proyecto Final - Tercer Entregable - Bank </w:t>
-      </w:r>
-      <w:proofErr w:type="spellStart"/>
-      <w:r>
-        <w:t>Marketing.ipynb</w:t>
-      </w:r>
-      <w:proofErr w:type="spellEnd"/>
-      <w:r>
-        <w:t xml:space="preserve">», sección 8.3. Las dos comparaciones con </w:t>
-      </w:r>
-      <w:proofErr w:type="spellStart"/>
-      <w:r>
-        <w:t>XGBoost</w:t>
-      </w:r>
-      <w:proofErr w:type="spellEnd"/>
-      <w:r>
-        <w:t xml:space="preserve"> se calcularon para este guion con las mismas funciones (</w:t>
-      </w:r>
-      <w:proofErr w:type="spellStart"/>
-      <w:r>
-        <w:t>diebold_mariano</w:t>
-      </w:r>
-      <w:proofErr w:type="spellEnd"/>
-      <w:r>
-        <w:t xml:space="preserve"> e </w:t>
-      </w:r>
-      <w:proofErr w:type="spellStart"/>
-      <w:r>
-        <w:t>ic_bootstrap_estacionario</w:t>
-      </w:r>
-      <w:proofErr w:type="spellEnd"/>
-      <w:r>
-        <w:t xml:space="preserve"> de </w:t>
-      </w:r>
-      <w:proofErr w:type="spellStart"/>
-      <w:r>
-        <w:t>src</w:t>
-      </w:r>
-      <w:proofErr w:type="spellEnd"/>
-      <w:r>
-        <w:t>/</w:t>
-      </w:r>
-      <w:proofErr w:type="spellStart"/>
-      <w:r>
-        <w:t>bm</w:t>
-      </w:r>
-      <w:proofErr w:type="spellEnd"/>
-      <w:r>
-        <w:t xml:space="preserve">/estadistica.py) sobre las mismas predicciones de prueba, y todavía no están en el cuaderno. Diferencia = pérdida cuadrática media de B − de A (positiva: A pronostica mejor); intervalo por </w:t>
-      </w:r>
-      <w:proofErr w:type="spellStart"/>
-      <w:r>
-        <w:t>bootstrap</w:t>
-      </w:r>
-      <w:proofErr w:type="spellEnd"/>
-      <w:r>
-        <w:t xml:space="preserve"> estacionario (</w:t>
-      </w:r>
-      <w:proofErr w:type="spellStart"/>
-      <w:r>
-        <w:t>Politis</w:t>
-      </w:r>
-      <w:proofErr w:type="spellEnd"/>
-      <w:r>
-        <w:t xml:space="preserve"> y Romano, 1994).</w:t>
+        <w:t xml:space="preserve"> La comparación Random Forest frente a Árbol de decisión está en el cuaderno «Proyecto Final - Tercer Entregable - Bank Marketing.ipynb», sección 8.3. Las dos comparaciones con XGBoost se calcularon para este guion con las mismas funciones (diebold_mariano e ic_bootstrap_estacionario de src/bm/estadistica.py) sobre las mismas predicciones de prueba, y todavía no están en el cuaderno. Diferencia = pérdida cuadrática media de B − de A (positiva: A pronostica mejor); intervalo por bootstrap estacionario (Politis y Romano, 1994).</w:t>
       </w:r>
     </w:p>
   </w:footnote>
@@ -14028,31 +12718,7 @@
         <w:footnoteRef/>
       </w:r>
       <w:r>
-        <w:t xml:space="preserve"> Fuente: cuaderno «Proyecto Final - Tercer Entregable - Bank </w:t>
-      </w:r>
-      <w:proofErr w:type="spellStart"/>
-      <w:r>
-        <w:t>Marketing.ipynb</w:t>
-      </w:r>
-      <w:proofErr w:type="spellEnd"/>
-      <w:r>
-        <w:t xml:space="preserve">», sección 8.4 (Intervalos de confianza al 95 % de las métricas principales). Bootstrap </w:t>
-      </w:r>
-      <w:proofErr w:type="spellStart"/>
-      <w:r>
-        <w:t>BCa</w:t>
-      </w:r>
-      <w:proofErr w:type="spellEnd"/>
-      <w:r>
-        <w:t xml:space="preserve"> con 1 000 réplicas sobre el conjunto de prueba; RMSE en escala log1p(</w:t>
-      </w:r>
-      <w:proofErr w:type="spellStart"/>
-      <w:r>
-        <w:t>duration</w:t>
-      </w:r>
-      <w:proofErr w:type="spellEnd"/>
-      <w:r>
-        <w:t>). La tabla completa incluye los 8 finalistas de clasificación (AUC y AUC-PR) y los 7 de regresión.</w:t>
+        <w:t xml:space="preserve"> Fuente: cuaderno «Proyecto Final - Tercer Entregable - Bank Marketing.ipynb», sección 8.4 (Intervalos de confianza al 95 % de las métricas principales). Bootstrap BCa con 1 000 réplicas sobre el conjunto de prueba; RMSE en escala log1p(duration). La tabla completa incluye los 8 finalistas de clasificación (AUC y AUC-PR) y los 7 de regresión.</w:t>
       </w:r>
     </w:p>
   </w:footnote>

</xml_diff>

<commit_message>
Alinear guion con cifras verificadas: quitar sección de auditoría no verificada, corregir 98,5 % y años de partición
Co-Authored-By: Claude Haiku 5.5 <noreply@anthropic.com>
</commit_message>
<xml_diff>
--- a/Guion de sustentación - Rúbrica - Bank Marketing.docx
+++ b/Guion de sustentación - Rúbrica - Bank Marketing.docx
@@ -1556,7 +1556,7 @@
         <w:t>cambio de régimen</w:t>
       </w:r>
       <w:r>
-        <w:t>. En el entrenamiento suscribe el 6,4 % de los clientes y en la prueba el 30,8 %, casi cinco veces más. El banco pasó de unas 3 294 llamadas por mes a 484, la tasa euribor a tres meses cayó de un rango de 1,3 a 5,0 % a otro de 0,6 a 1,3 %, de modo que el 99 % de la prueba queda fuera del rango visto al entrenar, y los clientes contactados antes pasaron del 0,5 % al 16,3 %. Además, con validación aleatoria el modelo base logra un AUC de 0,670, pero un modelo que solo conoce el año y el mes ya llega a 0,660; con validación temporal el AUC cae a 0,540. Es decir, la validación aleatoria está inflada por fuga temporal.</w:t>
+        <w:t>. En el entrenamiento suscribe el 6,4 % de los clientes y en la prueba el 30,8 %, casi cinco veces más. El banco pasó de unas 3 294 llamadas por mes a 484, la tasa euribor a tres meses cayó de un rango de 1,3 a 5,0 % a otro de 0,6 a 1,3 %, de modo que el 98,5 % de la prueba queda fuera del rango visto al entrenar, y los clientes contactados antes pasaron del 0,5 % al 16,3 %. Además, con validación aleatoria el modelo base logra un AUC de 0,670, pero un modelo que solo conoce el año y el mes ya llega a 0,660; con validación temporal el AUC cae a 0,540. Es decir, la validación aleatoria está inflada por fuga temporal.</w:t>
       </w:r>
     </w:p>
     <w:p>
@@ -1888,7 +1888,7 @@
         <w:t>capacidad de generalización</w:t>
       </w:r>
       <w:r>
-        <w:t>, que en este problema es lo decisivo. Los árboles predicen con funciones constantes por tramos y no pueden extrapolar fuera del rango del entrenamiento; como el 99 % de la prueba tiene un euribor nunca visto, tratan a esos clientes como si estuvieran en el borde del rango. La logística regularizada, en cambio, extrapola de forma lineal y suave. La evidencia es clara: XGBoost tiene el mejor rango promedio en los pliegues externos (3,00), pero en la prueba de 2009-2010 queda último en AUC-PR (0,369). Así mismo, el supuesto de independencia e igual distribución entre entrenamiento y prueba no se cumple, y por eso la regularización fuerte pesa más que la flexibilidad. De los otros modelos basta decir que Naive Bayes supone independencia condicional y variables gaussianas, y KNN es no paramétrico y depende de la distancia, lo que lo hace sensible a la escala y a la dimensión.</w:t>
+        <w:t>, que en este problema es lo decisivo. Los árboles predicen con funciones constantes por tramos y no pueden extrapolar fuera del rango del entrenamiento; como el 98,5 % de la prueba tiene un euribor fuera del rango del entrenamiento, tratan a esos clientes como si estuvieran en el borde del rango. La logística regularizada, en cambio, extrapola de forma lineal y suave. La evidencia es clara: XGBoost tiene el mejor rango promedio en los pliegues externos (3,00), pero en la prueba de 2009-2010 queda último en AUC-PR (0,369). Así mismo, el supuesto de independencia e igual distribución entre entrenamiento y prueba no se cumple, y por eso la regularización fuerte pesa más que la flexibilidad. De los otros modelos basta decir que Naive Bayes supone independencia condicional y variables gaussianas, y KNN es no paramétrico y depende de la distancia, lo que lo hace sensible a la escala y a la dimensión.</w:t>
       </w:r>
     </w:p>
     <w:p>
@@ -12298,7 +12298,7 @@
         <w:jc w:val="both"/>
       </w:pPr>
       <w:r>
-        <w:t>Porque los árboles no extrapolan: el 99 % de la prueba tiene un euribor fuera del rango del entrenamiento. XGBoost es el mejor en los pliegues externos (rango 3,00) y el último en la prueba (AUC-PR de 0,369): se ajustó al régimen de 2008.</w:t>
+        <w:t>Porque los árboles no extrapolan: el 98,5 % de la prueba tiene un euribor fuera del rango del entrenamiento. XGBoost es el mejor en los pliegues externos (rango 3,00) y el último en la prueba (AUC-PR de 0,369): se ajustó al régimen de 2008.</w:t>
       </w:r>
     </w:p>
     <w:p>
@@ -12399,94 +12399,6 @@
             </a:graphic>
           </wp:inline>
         </w:drawing>
-      </w:r>
-    </w:p>
-    <w:p>
-      <w:pPr>
-        <w:pStyle w:val="Ttulo1"/>
-      </w:pPr>
-      <w:r>
-        <w:t>Auditoría y validación</w:t>
-      </w:r>
-    </w:p>
-    <w:p>
-      <w:r>
-        <w:rPr>
-          <w:b/>
-        </w:rPr>
-        <w:t xml:space="preserve">Validación de robustez: </w:t>
-      </w:r>
-      <w:r>
-        <w:t>El proyecto fue sometido a una auditoría sistemática de cinco pasos para verificar que los resultados son creíbles y no artefactos de preprocesamiento, balanceo, o cálculo de métricas incorrecto.</w:t>
-      </w:r>
-    </w:p>
-    <w:p>
-      <w:r>
-        <w:rPr>
-          <w:b/>
-        </w:rPr>
-        <w:t xml:space="preserve">1. Baseline sencillo. </w:t>
-      </w:r>
-      <w:r>
-        <w:t>Se entrenó un DummyClassifier (predictor nulo) con la misma partición. Su AUC-PR es 0,308 (exactamente la prevalencia del test), mientras que Referencia E2 alcanza 0,579 con recalibración. La ganancia de +0,271 (88 % de mejora) confirma que el aprendizaje aporta valor real.</w:t>
-      </w:r>
-    </w:p>
-    <w:p>
-      <w:r>
-        <w:rPr>
-          <w:b/>
-        </w:rPr>
-        <w:t xml:space="preserve">2. Auditoría del pipeline. </w:t>
-      </w:r>
-      <w:r>
-        <w:t>Escalado y codificación fit-transform solo en X_tr; SMOTE/ADASYN aplicados solo en entrenamiento de cada pliegue; validación cruzada anidada (5 externos × 3 internos) sobre partición temporal; sin fuga de información.</w:t>
-      </w:r>
-    </w:p>
-    <w:p>
-      <w:r>
-        <w:rPr>
-          <w:b/>
-        </w:rPr>
-        <w:t xml:space="preserve">3. Revisión de probabilidades y etiquetas. </w:t>
-      </w:r>
-      <w:r>
-        <w:t>Uso de predict_proba para scores (nunca predict); clase positiva consistente (y=1 = suscribió CDT); conjunto test: 8236 obs, 2539 positivos (30,8 %), congruente con top-10 que alcanza precisión 0,80.</w:t>
-      </w:r>
-    </w:p>
-    <w:p>
-      <w:r>
-        <w:rPr>
-          <w:b/>
-        </w:rPr>
-        <w:t xml:space="preserve">4. Inspección de XGBoost. </w:t>
-      </w:r>
-      <w:r>
-        <w:t>AUC-ROC bajo (0,559) es esperado bajo desbalance severo; en AUC-PR alcanza 0,369 (superior a Árbol 0,374). Métrica objetivo: maximizar AUC-PR. Hiperparámetros recuperados del grid de optimización.</w:t>
-      </w:r>
-    </w:p>
-    <w:p>
-      <w:r>
-        <w:rPr>
-          <w:b/>
-        </w:rPr>
-        <w:t xml:space="preserve">5. Comparación train vs test. </w:t>
-      </w:r>
-      <w:r>
-        <w:t>Desempeño consistente (sin sobreajuste abrupto). La diferencia en prevalencia (6,4 % train vs 30,8 % test) refleja cambio temporal legítimo (2009–2010 vs 2013), motivo por el cual se implementó AUC-PR y recalibración mensual del intercepto.</w:t>
-      </w:r>
-    </w:p>
-    <w:p>
-      <w:pPr>
-        <w:spacing w:before="240"/>
-      </w:pPr>
-      <w:r>
-        <w:rPr>
-          <w:b/>
-        </w:rPr>
-        <w:t xml:space="preserve">Conclusión: </w:t>
-      </w:r>
-      <w:r>
-        <w:t>Todos los cinco puntos se cumplen. Los resultados (AUC-PR 0,579, recall 0,414, top-10 precisión 0,80) son robustos y reflejan aprendizaje legítimo, no artefactos de configuración.</w:t>
       </w:r>
     </w:p>
     <w:sectPr>

</xml_diff>